<commit_message>
mid of professional practice is completed
</commit_message>
<xml_diff>
--- a/8-semester/software process improvement/mid note.docx
+++ b/8-semester/software process improvement/mid note.docx
@@ -27,22 +27,8 @@
           <w:szCs w:val="27"/>
           <w:lang w:bidi="ar-SA"/>
         </w:rPr>
-        <w:t xml:space="preserve">Course Outline and </w:t>
-      </w:r>
-      <w:proofErr w:type="spellStart"/>
-      <w:r>
-        <w:rPr>
-          <w:rFonts w:ascii="Times New Roman" w:eastAsia="Times New Roman" w:hAnsi="Times New Roman" w:cs="Times New Roman"/>
-          <w:b/>
-          <w:bCs/>
-          <w:color w:val="1F1F1F"/>
-          <w:sz w:val="27"/>
-          <w:szCs w:val="27"/>
-          <w:lang w:bidi="ar-SA"/>
-        </w:rPr>
-        <w:t>Introuduction</w:t>
-      </w:r>
-      <w:proofErr w:type="spellEnd"/>
+        <w:t>Course Outline and Introduction</w:t>
+      </w:r>
     </w:p>
     <w:p>
       <w:pPr>
@@ -747,7 +733,32 @@
           <w:sz w:val="24"/>
           <w:szCs w:val="24"/>
         </w:rPr>
-        <w:t>Lean is a software development methodology that focuses on delivering value to the customer by eliminating waste. The goal is to deliver what the customer wants as quickly and efficiently as possible.</w:t>
+        <w:t>Lean is a software development methodology that focuses on delivering value to the customer by eliminating waste</w:t>
+      </w:r>
+      <w:r>
+        <w:rPr>
+          <w:rFonts w:asciiTheme="majorBidi" w:hAnsiTheme="majorBidi" w:cstheme="majorBidi"/>
+          <w:sz w:val="24"/>
+          <w:szCs w:val="24"/>
+        </w:rPr>
+        <w:t>,</w:t>
+      </w:r>
+      <w:r>
+        <w:t xml:space="preserve"> </w:t>
+      </w:r>
+      <w:r>
+        <w:t>improving efficiency, and continuously improving the development</w:t>
+      </w:r>
+      <w:r>
+        <w:t xml:space="preserve"> process</w:t>
+      </w:r>
+      <w:r>
+        <w:rPr>
+          <w:rFonts w:asciiTheme="majorBidi" w:hAnsiTheme="majorBidi" w:cstheme="majorBidi"/>
+          <w:sz w:val="24"/>
+          <w:szCs w:val="24"/>
+        </w:rPr>
+        <w:t>. The goal is to deliver what the customer wants as quickly and efficiently as possible.</w:t>
       </w:r>
     </w:p>
     <w:p>
@@ -1009,7 +1020,7 @@
           <w:sz w:val="24"/>
           <w:szCs w:val="24"/>
         </w:rPr>
-        <w:t>Defer Commitment –</w:t>
+        <w:t xml:space="preserve">Defer Commitment </w:t>
       </w:r>
     </w:p>
     <w:p>
@@ -2980,18 +2991,16 @@
           <w:szCs w:val="24"/>
         </w:rPr>
         <w:lastRenderedPageBreak/>
-        <w:t xml:space="preserve">PDCA Cycle is a </w:t>
-      </w:r>
-      <w:proofErr w:type="gramStart"/>
+        <w:t>PDCA Cycle is a four step</w:t>
+      </w:r>
       <w:r>
         <w:rPr>
           <w:rFonts w:asciiTheme="majorBidi" w:hAnsiTheme="majorBidi" w:cstheme="majorBidi"/>
           <w:sz w:val="24"/>
           <w:szCs w:val="24"/>
         </w:rPr>
-        <w:t>four step</w:t>
-      </w:r>
-      <w:proofErr w:type="gramEnd"/>
+        <w:t>s</w:t>
+      </w:r>
       <w:r>
         <w:rPr>
           <w:rFonts w:asciiTheme="majorBidi" w:hAnsiTheme="majorBidi" w:cstheme="majorBidi"/>
@@ -2999,6 +3008,14 @@
           <w:szCs w:val="24"/>
         </w:rPr>
         <w:t xml:space="preserve"> model is used for following</w:t>
+      </w:r>
+      <w:r>
+        <w:rPr>
+          <w:rFonts w:asciiTheme="majorBidi" w:hAnsiTheme="majorBidi" w:cstheme="majorBidi"/>
+          <w:sz w:val="24"/>
+          <w:szCs w:val="24"/>
+        </w:rPr>
+        <w:t>.</w:t>
       </w:r>
     </w:p>
     <w:p>
@@ -3398,9 +3415,8 @@
           <w:sz w:val="24"/>
           <w:szCs w:val="24"/>
         </w:rPr>
-        <w:t xml:space="preserve">Scope </w:t>
-      </w:r>
-      <w:proofErr w:type="spellStart"/>
+        <w:t>Scope Definition:</w:t>
+      </w:r>
       <w:r>
         <w:rPr>
           <w:rFonts w:asciiTheme="majorBidi" w:hAnsiTheme="majorBidi" w:cstheme="majorBidi"/>
@@ -3409,34 +3425,15 @@
           <w:sz w:val="24"/>
           <w:szCs w:val="24"/>
         </w:rPr>
-        <w:t>Definition</w:t>
+        <w:t xml:space="preserve"> </w:t>
       </w:r>
       <w:r>
         <w:rPr>
           <w:rFonts w:asciiTheme="majorBidi" w:hAnsiTheme="majorBidi" w:cstheme="majorBidi"/>
-          <w:b/>
-          <w:bCs/>
-          <w:sz w:val="24"/>
-          <w:szCs w:val="24"/>
-        </w:rPr>
-        <w:t>:</w:t>
-      </w:r>
-      <w:r>
-        <w:rPr>
-          <w:rFonts w:asciiTheme="majorBidi" w:hAnsiTheme="majorBidi" w:cstheme="majorBidi"/>
-          <w:sz w:val="24"/>
-          <w:szCs w:val="24"/>
-        </w:rPr>
-        <w:t>Clearly</w:t>
-      </w:r>
-      <w:proofErr w:type="spellEnd"/>
-      <w:r>
-        <w:rPr>
-          <w:rFonts w:asciiTheme="majorBidi" w:hAnsiTheme="majorBidi" w:cstheme="majorBidi"/>
-          <w:sz w:val="24"/>
-          <w:szCs w:val="24"/>
-        </w:rPr>
-        <w:t xml:space="preserve"> define the scope and boundaries of the improvement project</w:t>
+          <w:sz w:val="24"/>
+          <w:szCs w:val="24"/>
+        </w:rPr>
+        <w:t>Clearly define the scope and boundaries of the improvement project</w:t>
       </w:r>
       <w:r>
         <w:rPr>
@@ -3482,15 +3479,7 @@
           <w:sz w:val="24"/>
           <w:szCs w:val="24"/>
         </w:rPr>
-        <w:t>:</w:t>
-      </w:r>
-      <w:r>
-        <w:rPr>
-          <w:rFonts w:asciiTheme="majorBidi" w:hAnsiTheme="majorBidi" w:cstheme="majorBidi"/>
-          <w:sz w:val="24"/>
-          <w:szCs w:val="24"/>
-        </w:rPr>
-        <w:t xml:space="preserve"> Develop a detailed plan outlining the actions needed to achieve the objectives. This may include changes to processes, training, resource allocation, etc.</w:t>
+        <w:t>: Develop a detailed plan outlining the actions needed to achieve the objectives. This may include changes to processes, training, resource allocation, etc.</w:t>
       </w:r>
     </w:p>
     <w:p>
@@ -3781,15 +3770,7 @@
           <w:sz w:val="24"/>
           <w:szCs w:val="24"/>
         </w:rPr>
-        <w:t>Record any changes made during the implementation phase</w:t>
-      </w:r>
-      <w:r>
-        <w:rPr>
-          <w:rFonts w:asciiTheme="majorBidi" w:hAnsiTheme="majorBidi" w:cstheme="majorBidi"/>
-          <w:sz w:val="24"/>
-          <w:szCs w:val="24"/>
-        </w:rPr>
-        <w:t>.</w:t>
+        <w:t>Record any changes made during the implementation phase.</w:t>
       </w:r>
     </w:p>
     <w:p>
@@ -3864,6 +3845,19 @@
     </w:p>
     <w:p>
       <w:pPr>
+        <w:spacing w:before="100" w:beforeAutospacing="1" w:after="0" w:line="240" w:lineRule="auto"/>
+        <w:ind w:left="360"/>
+        <w:rPr>
+          <w:rFonts w:asciiTheme="majorBidi" w:eastAsia="Times New Roman" w:hAnsiTheme="majorBidi" w:cstheme="majorBidi"/>
+          <w:color w:val="1F1F1F"/>
+          <w:sz w:val="24"/>
+          <w:szCs w:val="24"/>
+          <w:lang w:bidi="ar-SA"/>
+        </w:rPr>
+      </w:pPr>
+    </w:p>
+    <w:p>
+      <w:pPr>
         <w:spacing w:before="100" w:beforeAutospacing="1" w:after="120" w:line="240" w:lineRule="auto"/>
         <w:outlineLvl w:val="2"/>
         <w:rPr>
@@ -3886,6 +3880,7 @@
           <w:szCs w:val="24"/>
           <w:lang w:bidi="ar-SA"/>
         </w:rPr>
+        <w:lastRenderedPageBreak/>
         <w:t>3. Check (The Review)</w:t>
       </w:r>
     </w:p>
@@ -3908,7 +3903,6 @@
           <w:szCs w:val="24"/>
           <w:lang w:bidi="ar-SA"/>
         </w:rPr>
-        <w:lastRenderedPageBreak/>
         <w:t>After the trial, you look at the data to see if the plan actually worked.</w:t>
       </w:r>
     </w:p>

</xml_diff>

<commit_message>
spi mid is completed
</commit_message>
<xml_diff>
--- a/8-semester/software process improvement/mid note.docx
+++ b/8-semester/software process improvement/mid note.docx
@@ -32,6 +32,64 @@
     </w:p>
     <w:p>
       <w:pPr>
+        <w:spacing w:after="120" w:line="240" w:lineRule="auto"/>
+        <w:outlineLvl w:val="2"/>
+        <w:rPr>
+          <w:rFonts w:ascii="Times New Roman" w:eastAsia="Times New Roman" w:hAnsi="Times New Roman" w:cs="Times New Roman"/>
+          <w:b/>
+          <w:bCs/>
+          <w:color w:val="1F1F1F"/>
+          <w:sz w:val="27"/>
+          <w:szCs w:val="27"/>
+          <w:lang w:bidi="ar-SA"/>
+        </w:rPr>
+      </w:pPr>
+      <w:r>
+        <w:rPr>
+          <w:rFonts w:ascii="Times New Roman" w:eastAsia="Times New Roman" w:hAnsi="Times New Roman" w:cs="Times New Roman"/>
+          <w:b/>
+          <w:bCs/>
+          <w:color w:val="1F1F1F"/>
+          <w:sz w:val="27"/>
+          <w:szCs w:val="27"/>
+          <w:lang w:bidi="ar-SA"/>
+        </w:rPr>
+        <w:t>1. What is a Software Process?</w:t>
+      </w:r>
+    </w:p>
+    <w:p>
+      <w:pPr>
+        <w:spacing w:after="120" w:line="240" w:lineRule="auto"/>
+        <w:outlineLvl w:val="2"/>
+        <w:rPr>
+          <w:rFonts w:asciiTheme="majorBidi" w:eastAsia="Times New Roman" w:hAnsiTheme="majorBidi" w:cstheme="majorBidi"/>
+          <w:b/>
+          <w:bCs/>
+          <w:color w:val="1F1F1F"/>
+          <w:sz w:val="24"/>
+          <w:szCs w:val="24"/>
+          <w:lang w:bidi="ar-SA"/>
+        </w:rPr>
+      </w:pPr>
+      <w:r>
+        <w:rPr>
+          <w:rFonts w:asciiTheme="majorBidi" w:hAnsiTheme="majorBidi" w:cstheme="majorBidi"/>
+          <w:sz w:val="24"/>
+          <w:szCs w:val="24"/>
+        </w:rPr>
+        <w:t>A software process is a set of activities used to specify, design, implement, test, and maintain software systems</w:t>
+      </w:r>
+      <w:r>
+        <w:rPr>
+          <w:rFonts w:asciiTheme="majorBidi" w:hAnsiTheme="majorBidi" w:cstheme="majorBidi"/>
+          <w:sz w:val="24"/>
+          <w:szCs w:val="24"/>
+        </w:rPr>
+        <w:t>.</w:t>
+      </w:r>
+    </w:p>
+    <w:p>
+      <w:pPr>
         <w:spacing w:before="100" w:beforeAutospacing="1" w:after="120" w:line="240" w:lineRule="auto"/>
         <w:outlineLvl w:val="2"/>
         <w:rPr>
@@ -54,79 +112,90 @@
           <w:szCs w:val="27"/>
           <w:lang w:bidi="ar-SA"/>
         </w:rPr>
-        <w:t>1. What is a Software Process?</w:t>
-      </w:r>
-    </w:p>
-    <w:p>
-      <w:pPr>
-        <w:spacing w:before="100" w:beforeAutospacing="1" w:after="120" w:line="240" w:lineRule="auto"/>
-        <w:outlineLvl w:val="2"/>
+        <w:t>2. What is Software Process Improvement (SPI)?</w:t>
+      </w:r>
+    </w:p>
+    <w:p>
+      <w:pPr>
+        <w:spacing w:after="0" w:line="240" w:lineRule="auto"/>
+        <w:rPr>
+          <w:rFonts w:ascii="Times New Roman" w:eastAsia="Times New Roman" w:hAnsi="Times New Roman" w:cs="Times New Roman"/>
+          <w:color w:val="1F1F1F"/>
+          <w:sz w:val="24"/>
+          <w:szCs w:val="24"/>
+          <w:bdr w:val="none" w:sz="0" w:space="0" w:color="auto" w:frame="1"/>
+          <w:lang w:bidi="ar-SA"/>
+        </w:rPr>
+      </w:pPr>
+      <w:r>
+        <w:rPr>
+          <w:rFonts w:ascii="Times New Roman" w:eastAsia="Times New Roman" w:hAnsi="Times New Roman" w:cs="Times New Roman"/>
+          <w:color w:val="1F1F1F"/>
+          <w:sz w:val="24"/>
+          <w:szCs w:val="24"/>
+          <w:bdr w:val="none" w:sz="0" w:space="0" w:color="auto" w:frame="1"/>
+          <w:lang w:bidi="ar-SA"/>
+        </w:rPr>
+        <w:t>Software Process Improvement (SPI) is a systematic approach to analyzing, evaluating, and enhancing an organization’s software development methods to improve quality, efficiency, and project outcomes.</w:t>
+      </w:r>
+    </w:p>
+    <w:p>
+      <w:pPr>
+        <w:spacing w:after="0" w:line="240" w:lineRule="auto"/>
         <w:rPr>
           <w:rFonts w:asciiTheme="majorBidi" w:eastAsia="Times New Roman" w:hAnsiTheme="majorBidi" w:cstheme="majorBidi"/>
-          <w:b/>
-          <w:bCs/>
-          <w:color w:val="1F1F1F"/>
-          <w:sz w:val="24"/>
-          <w:szCs w:val="24"/>
-          <w:lang w:bidi="ar-SA"/>
-        </w:rPr>
-      </w:pPr>
-      <w:r>
-        <w:rPr>
-          <w:rFonts w:asciiTheme="majorBidi" w:hAnsiTheme="majorBidi" w:cstheme="majorBidi"/>
-          <w:sz w:val="24"/>
-          <w:szCs w:val="24"/>
-        </w:rPr>
-        <w:t>A software process is a set of activities used to specify, design, implement, test, and maintain software systems</w:t>
-      </w:r>
-      <w:r>
-        <w:rPr>
-          <w:rFonts w:asciiTheme="majorBidi" w:hAnsiTheme="majorBidi" w:cstheme="majorBidi"/>
-          <w:sz w:val="24"/>
-          <w:szCs w:val="24"/>
-        </w:rPr>
-        <w:t>.</w:t>
-      </w:r>
-    </w:p>
-    <w:p>
-      <w:pPr>
-        <w:spacing w:before="100" w:beforeAutospacing="1" w:after="120" w:line="240" w:lineRule="auto"/>
-        <w:outlineLvl w:val="2"/>
-        <w:rPr>
-          <w:rFonts w:ascii="Times New Roman" w:eastAsia="Times New Roman" w:hAnsi="Times New Roman" w:cs="Times New Roman"/>
-          <w:b/>
-          <w:bCs/>
-          <w:color w:val="1F1F1F"/>
-          <w:sz w:val="27"/>
-          <w:szCs w:val="27"/>
-          <w:lang w:bidi="ar-SA"/>
-        </w:rPr>
-      </w:pPr>
-      <w:r>
-        <w:rPr>
-          <w:rFonts w:ascii="Times New Roman" w:eastAsia="Times New Roman" w:hAnsi="Times New Roman" w:cs="Times New Roman"/>
-          <w:b/>
-          <w:bCs/>
-          <w:color w:val="1F1F1F"/>
-          <w:sz w:val="27"/>
-          <w:szCs w:val="27"/>
-          <w:lang w:bidi="ar-SA"/>
-        </w:rPr>
-        <w:t>2. What is Software Process Improvement (SPI)?</w:t>
-      </w:r>
-    </w:p>
-    <w:p>
-      <w:pPr>
-        <w:spacing w:before="100" w:beforeAutospacing="1" w:after="0" w:line="240" w:lineRule="auto"/>
-        <w:rPr>
-          <w:rFonts w:ascii="Times New Roman" w:eastAsia="Times New Roman" w:hAnsi="Times New Roman" w:cs="Times New Roman"/>
+          <w:color w:val="1F1F1F"/>
+          <w:sz w:val="24"/>
+          <w:szCs w:val="24"/>
+          <w:lang w:bidi="ar-SA"/>
+        </w:rPr>
+      </w:pPr>
+      <w:r>
+        <w:rPr>
+          <w:rStyle w:val="citation-35"/>
+          <w:rFonts w:asciiTheme="majorBidi" w:hAnsiTheme="majorBidi" w:cstheme="majorBidi"/>
+          <w:sz w:val="24"/>
+          <w:szCs w:val="24"/>
+        </w:rPr>
+        <w:t>To help organizations improve, there are international "gold standards" or models they can follow</w:t>
+      </w:r>
+      <w:r>
+        <w:rPr>
+          <w:rFonts w:asciiTheme="majorBidi" w:hAnsiTheme="majorBidi" w:cstheme="majorBidi"/>
+          <w:sz w:val="24"/>
+          <w:szCs w:val="24"/>
+        </w:rPr>
+        <w:t>:</w:t>
+      </w:r>
+    </w:p>
+    <w:p>
+      <w:pPr>
+        <w:numPr>
+          <w:ilvl w:val="0"/>
+          <w:numId w:val="2"/>
+        </w:numPr>
+        <w:spacing w:after="0" w:line="240" w:lineRule="auto"/>
+        <w:rPr>
+          <w:rFonts w:ascii="Times New Roman" w:eastAsia="Times New Roman" w:hAnsi="Times New Roman" w:cs="Times New Roman"/>
+          <w:color w:val="1F1F1F"/>
+          <w:sz w:val="24"/>
+          <w:szCs w:val="24"/>
+          <w:lang w:bidi="ar-SA"/>
+        </w:rPr>
+      </w:pPr>
+      <w:r>
+        <w:rPr>
+          <w:rFonts w:ascii="Times New Roman" w:eastAsia="Times New Roman" w:hAnsi="Times New Roman" w:cs="Times New Roman"/>
+          <w:b/>
+          <w:bCs/>
           <w:color w:val="1F1F1F"/>
           <w:sz w:val="24"/>
           <w:szCs w:val="24"/>
           <w:bdr w:val="none" w:sz="0" w:space="0" w:color="auto" w:frame="1"/>
           <w:lang w:bidi="ar-SA"/>
         </w:rPr>
-      </w:pPr>
+        <w:t>CMMI Model:</w:t>
+      </w:r>
       <w:r>
         <w:rPr>
           <w:rFonts w:ascii="Times New Roman" w:eastAsia="Times New Roman" w:hAnsi="Times New Roman" w:cs="Times New Roman"/>
@@ -136,36 +205,7 @@
           <w:bdr w:val="none" w:sz="0" w:space="0" w:color="auto" w:frame="1"/>
           <w:lang w:bidi="ar-SA"/>
         </w:rPr>
-        <w:t>Software Process Improvement (SPI) is a systematic approach to analyzing, evaluating, and enhancing an organization’s software development methods to improve quality, efficiency, and project outcomes.</w:t>
-      </w:r>
-    </w:p>
-    <w:p>
-      <w:pPr>
-        <w:spacing w:before="100" w:beforeAutospacing="1" w:after="0" w:line="240" w:lineRule="auto"/>
-        <w:rPr>
-          <w:rFonts w:asciiTheme="majorBidi" w:eastAsia="Times New Roman" w:hAnsiTheme="majorBidi" w:cstheme="majorBidi"/>
-          <w:color w:val="1F1F1F"/>
-          <w:sz w:val="24"/>
-          <w:szCs w:val="24"/>
-          <w:lang w:bidi="ar-SA"/>
-        </w:rPr>
-      </w:pPr>
-      <w:r>
-        <w:rPr>
-          <w:rStyle w:val="citation-35"/>
-          <w:rFonts w:asciiTheme="majorBidi" w:hAnsiTheme="majorBidi" w:cstheme="majorBidi"/>
-          <w:sz w:val="24"/>
-          <w:szCs w:val="24"/>
-        </w:rPr>
-        <w:t>To help organizations improve, there are international "gold standards" or models they can follow</w:t>
-      </w:r>
-      <w:r>
-        <w:rPr>
-          <w:rFonts w:asciiTheme="majorBidi" w:hAnsiTheme="majorBidi" w:cstheme="majorBidi"/>
-          <w:sz w:val="24"/>
-          <w:szCs w:val="24"/>
-        </w:rPr>
-        <w:t>:</w:t>
+        <w:t xml:space="preserve"> A collection of best practices for software and systems engineering.</w:t>
       </w:r>
     </w:p>
     <w:p>
@@ -194,7 +234,7 @@
           <w:bdr w:val="none" w:sz="0" w:space="0" w:color="auto" w:frame="1"/>
           <w:lang w:bidi="ar-SA"/>
         </w:rPr>
-        <w:t>CMMI Model:</w:t>
+        <w:t>ISO 9001:</w:t>
       </w:r>
       <w:r>
         <w:rPr>
@@ -205,7 +245,7 @@
           <w:bdr w:val="none" w:sz="0" w:space="0" w:color="auto" w:frame="1"/>
           <w:lang w:bidi="ar-SA"/>
         </w:rPr>
-        <w:t xml:space="preserve"> A collection of best practices for software and systems engineering.</w:t>
+        <w:t xml:space="preserve"> A general quality management system used by many types of companies.</w:t>
       </w:r>
     </w:p>
     <w:p>
@@ -234,7 +274,7 @@
           <w:bdr w:val="none" w:sz="0" w:space="0" w:color="auto" w:frame="1"/>
           <w:lang w:bidi="ar-SA"/>
         </w:rPr>
-        <w:t>ISO 9001:</w:t>
+        <w:t>ISO 15504:</w:t>
       </w:r>
       <w:r>
         <w:rPr>
@@ -245,16 +285,66 @@
           <w:bdr w:val="none" w:sz="0" w:space="0" w:color="auto" w:frame="1"/>
           <w:lang w:bidi="ar-SA"/>
         </w:rPr>
-        <w:t xml:space="preserve"> A general quality management system used by many types of companies.</w:t>
+        <w:t xml:space="preserve"> A specific international standard for assessing and improving software processes.</w:t>
+      </w:r>
+    </w:p>
+    <w:p>
+      <w:pPr>
+        <w:spacing w:before="100" w:beforeAutospacing="1" w:after="120" w:line="240" w:lineRule="auto"/>
+        <w:outlineLvl w:val="2"/>
+        <w:rPr>
+          <w:rFonts w:ascii="Times New Roman" w:eastAsia="Times New Roman" w:hAnsi="Times New Roman" w:cs="Times New Roman"/>
+          <w:b/>
+          <w:bCs/>
+          <w:color w:val="1F1F1F"/>
+          <w:sz w:val="27"/>
+          <w:szCs w:val="27"/>
+          <w:lang w:bidi="ar-SA"/>
+        </w:rPr>
+      </w:pPr>
+      <w:r>
+        <w:rPr>
+          <w:rFonts w:ascii="Times New Roman" w:eastAsia="Times New Roman" w:hAnsi="Times New Roman" w:cs="Times New Roman"/>
+          <w:b/>
+          <w:bCs/>
+          <w:color w:val="1F1F1F"/>
+          <w:sz w:val="27"/>
+          <w:szCs w:val="27"/>
+          <w:lang w:bidi="ar-SA"/>
+        </w:rPr>
+        <w:t>3. Why do we need SPI? (The Motivation)</w:t>
+      </w:r>
+    </w:p>
+    <w:p>
+      <w:pPr>
+        <w:spacing w:after="0" w:line="240" w:lineRule="auto"/>
+        <w:rPr>
+          <w:rFonts w:ascii="Times New Roman" w:eastAsia="Times New Roman" w:hAnsi="Times New Roman" w:cs="Times New Roman"/>
+          <w:color w:val="1F1F1F"/>
+          <w:sz w:val="24"/>
+          <w:szCs w:val="24"/>
+          <w:lang w:bidi="ar-SA"/>
+        </w:rPr>
+      </w:pPr>
+      <w:r>
+        <w:rPr>
+          <w:rFonts w:ascii="Times New Roman" w:eastAsia="Times New Roman" w:hAnsi="Times New Roman" w:cs="Times New Roman"/>
+          <w:color w:val="1F1F1F"/>
+          <w:sz w:val="24"/>
+          <w:szCs w:val="24"/>
+          <w:bdr w:val="none" w:sz="0" w:space="0" w:color="auto" w:frame="1"/>
+          <w:lang w:bidi="ar-SA"/>
+        </w:rPr>
+        <w:t>Software is everywhere today—from the websites we browse and the mobile phones we use to the systems that control automobiles, nuclear power stations, and even washing machines. Because we rely on software for safety and daily life, it is essential that it is:</w:t>
       </w:r>
     </w:p>
     <w:p>
       <w:pPr>
         <w:numPr>
           <w:ilvl w:val="0"/>
-          <w:numId w:val="2"/>
+          <w:numId w:val="3"/>
         </w:numPr>
-        <w:spacing w:before="100" w:beforeAutospacing="1" w:after="0" w:line="240" w:lineRule="auto"/>
+        <w:spacing w:after="0" w:line="240" w:lineRule="auto"/>
         <w:rPr>
           <w:rFonts w:ascii="Times New Roman" w:eastAsia="Times New Roman" w:hAnsi="Times New Roman" w:cs="Times New Roman"/>
           <w:color w:val="1F1F1F"/>
@@ -274,7 +364,7 @@
           <w:bdr w:val="none" w:sz="0" w:space="0" w:color="auto" w:frame="1"/>
           <w:lang w:bidi="ar-SA"/>
         </w:rPr>
-        <w:t>ISO 15504:</w:t>
+        <w:t>Safe and Reliable</w:t>
       </w:r>
       <w:r>
         <w:rPr>
@@ -285,57 +375,47 @@
           <w:bdr w:val="none" w:sz="0" w:space="0" w:color="auto" w:frame="1"/>
           <w:lang w:bidi="ar-SA"/>
         </w:rPr>
-        <w:t xml:space="preserve"> A specific international standard for assessing and improving software processes.</w:t>
-      </w:r>
-    </w:p>
-    <w:p>
-      <w:pPr>
-        <w:spacing w:before="100" w:beforeAutospacing="1" w:after="120" w:line="240" w:lineRule="auto"/>
-        <w:outlineLvl w:val="2"/>
-        <w:rPr>
-          <w:rFonts w:ascii="Times New Roman" w:eastAsia="Times New Roman" w:hAnsi="Times New Roman" w:cs="Times New Roman"/>
-          <w:b/>
-          <w:bCs/>
-          <w:color w:val="1F1F1F"/>
-          <w:sz w:val="27"/>
-          <w:szCs w:val="27"/>
-          <w:lang w:bidi="ar-SA"/>
-        </w:rPr>
-      </w:pPr>
-      <w:r>
-        <w:rPr>
-          <w:rFonts w:ascii="Times New Roman" w:eastAsia="Times New Roman" w:hAnsi="Times New Roman" w:cs="Times New Roman"/>
-          <w:b/>
-          <w:bCs/>
-          <w:color w:val="1F1F1F"/>
-          <w:sz w:val="27"/>
-          <w:szCs w:val="27"/>
-          <w:lang w:bidi="ar-SA"/>
-        </w:rPr>
-        <w:t>3. Why do we need SPI? (The Motivation)</w:t>
-      </w:r>
-    </w:p>
-    <w:p>
-      <w:pPr>
-        <w:spacing w:before="100" w:beforeAutospacing="1" w:after="0" w:line="240" w:lineRule="auto"/>
-        <w:rPr>
-          <w:rFonts w:ascii="Times New Roman" w:eastAsia="Times New Roman" w:hAnsi="Times New Roman" w:cs="Times New Roman"/>
-          <w:color w:val="1F1F1F"/>
-          <w:sz w:val="24"/>
-          <w:szCs w:val="24"/>
-          <w:lang w:bidi="ar-SA"/>
-        </w:rPr>
-      </w:pPr>
-      <w:r>
-        <w:rPr>
-          <w:rFonts w:ascii="Times New Roman" w:eastAsia="Times New Roman" w:hAnsi="Times New Roman" w:cs="Times New Roman"/>
+        <w:t>.</w:t>
+      </w:r>
+    </w:p>
+    <w:p>
+      <w:pPr>
+        <w:numPr>
+          <w:ilvl w:val="0"/>
+          <w:numId w:val="3"/>
+        </w:numPr>
+        <w:spacing w:after="0" w:line="240" w:lineRule="auto"/>
+        <w:rPr>
+          <w:rFonts w:ascii="Times New Roman" w:eastAsia="Times New Roman" w:hAnsi="Times New Roman" w:cs="Times New Roman"/>
+          <w:color w:val="1F1F1F"/>
+          <w:sz w:val="24"/>
+          <w:szCs w:val="24"/>
+          <w:lang w:bidi="ar-SA"/>
+        </w:rPr>
+      </w:pPr>
+      <w:r>
+        <w:rPr>
+          <w:rFonts w:ascii="Times New Roman" w:eastAsia="Times New Roman" w:hAnsi="Times New Roman" w:cs="Times New Roman"/>
+          <w:b/>
+          <w:bCs/>
           <w:color w:val="1F1F1F"/>
           <w:sz w:val="24"/>
           <w:szCs w:val="24"/>
           <w:bdr w:val="none" w:sz="0" w:space="0" w:color="auto" w:frame="1"/>
           <w:lang w:bidi="ar-SA"/>
         </w:rPr>
-        <w:t>Software is everywhere today—from the websites we browse and the mobile phones we use to the systems that control automobiles, nuclear power stations, and even washing machines. Because we rely on software for safety and daily life, it is essential that it is:</w:t>
+        <w:t>High Quality</w:t>
+      </w:r>
+      <w:r>
+        <w:rPr>
+          <w:rFonts w:ascii="Times New Roman" w:eastAsia="Times New Roman" w:hAnsi="Times New Roman" w:cs="Times New Roman"/>
+          <w:color w:val="1F1F1F"/>
+          <w:sz w:val="24"/>
+          <w:szCs w:val="24"/>
+          <w:bdr w:val="none" w:sz="0" w:space="0" w:color="auto" w:frame="1"/>
+          <w:lang w:bidi="ar-SA"/>
+        </w:rPr>
+        <w:t>.</w:t>
       </w:r>
     </w:p>
     <w:p>
@@ -345,13 +425,6 @@
           <w:numId w:val="3"/>
         </w:numPr>
         <w:spacing w:before="100" w:beforeAutospacing="1" w:after="0" w:line="240" w:lineRule="auto"/>
-        <w:rPr>
-          <w:rFonts w:ascii="Times New Roman" w:eastAsia="Times New Roman" w:hAnsi="Times New Roman" w:cs="Times New Roman"/>
-          <w:color w:val="1F1F1F"/>
-          <w:sz w:val="24"/>
-          <w:szCs w:val="24"/>
-          <w:lang w:bidi="ar-SA"/>
-        </w:rPr>
       </w:pPr>
       <w:r>
         <w:rPr>
@@ -364,7 +437,7 @@
           <w:bdr w:val="none" w:sz="0" w:space="0" w:color="auto" w:frame="1"/>
           <w:lang w:bidi="ar-SA"/>
         </w:rPr>
-        <w:t>Safe and Reliable</w:t>
+        <w:t>Fit for Purpose</w:t>
       </w:r>
       <w:r>
         <w:rPr>
@@ -375,328 +448,491 @@
           <w:bdr w:val="none" w:sz="0" w:space="0" w:color="auto" w:frame="1"/>
           <w:lang w:bidi="ar-SA"/>
         </w:rPr>
-        <w:t>.</w:t>
+        <w:t xml:space="preserve"> (it does exactly what it's supposed to do).</w:t>
+      </w:r>
+    </w:p>
+    <w:p>
+      <w:pPr>
+        <w:spacing w:before="100" w:beforeAutospacing="1" w:after="100" w:afterAutospacing="1" w:line="240" w:lineRule="auto"/>
+        <w:outlineLvl w:val="2"/>
+        <w:rPr>
+          <w:rFonts w:ascii="Times New Roman" w:eastAsia="Times New Roman" w:hAnsi="Times New Roman" w:cs="Times New Roman"/>
+          <w:b/>
+          <w:bCs/>
+          <w:sz w:val="27"/>
+          <w:szCs w:val="27"/>
+          <w:lang w:bidi="ar-SA"/>
+        </w:rPr>
+      </w:pPr>
+      <w:r>
+        <w:rPr>
+          <w:rFonts w:ascii="Times New Roman" w:eastAsia="Times New Roman" w:hAnsi="Times New Roman" w:cs="Times New Roman"/>
+          <w:b/>
+          <w:bCs/>
+          <w:sz w:val="27"/>
+          <w:szCs w:val="27"/>
+          <w:lang w:bidi="ar-SA"/>
+        </w:rPr>
+        <w:t>Importance of Software Process Improvement</w:t>
       </w:r>
     </w:p>
     <w:p>
       <w:pPr>
         <w:numPr>
           <w:ilvl w:val="0"/>
-          <w:numId w:val="3"/>
+          <w:numId w:val="19"/>
         </w:numPr>
-        <w:spacing w:before="100" w:beforeAutospacing="1" w:after="0" w:line="240" w:lineRule="auto"/>
-        <w:rPr>
-          <w:rFonts w:ascii="Times New Roman" w:eastAsia="Times New Roman" w:hAnsi="Times New Roman" w:cs="Times New Roman"/>
-          <w:color w:val="1F1F1F"/>
-          <w:sz w:val="24"/>
-          <w:szCs w:val="24"/>
-          <w:lang w:bidi="ar-SA"/>
-        </w:rPr>
-      </w:pPr>
-      <w:r>
-        <w:rPr>
-          <w:rFonts w:ascii="Times New Roman" w:eastAsia="Times New Roman" w:hAnsi="Times New Roman" w:cs="Times New Roman"/>
-          <w:b/>
-          <w:bCs/>
-          <w:color w:val="1F1F1F"/>
-          <w:sz w:val="24"/>
-          <w:szCs w:val="24"/>
-          <w:bdr w:val="none" w:sz="0" w:space="0" w:color="auto" w:frame="1"/>
-          <w:lang w:bidi="ar-SA"/>
-        </w:rPr>
-        <w:t>High Quality</w:t>
-      </w:r>
-      <w:r>
-        <w:rPr>
-          <w:rFonts w:ascii="Times New Roman" w:eastAsia="Times New Roman" w:hAnsi="Times New Roman" w:cs="Times New Roman"/>
-          <w:color w:val="1F1F1F"/>
-          <w:sz w:val="24"/>
-          <w:szCs w:val="24"/>
-          <w:bdr w:val="none" w:sz="0" w:space="0" w:color="auto" w:frame="1"/>
-          <w:lang w:bidi="ar-SA"/>
-        </w:rPr>
-        <w:t>.</w:t>
+        <w:spacing w:before="100" w:beforeAutospacing="1" w:after="100" w:afterAutospacing="1" w:line="240" w:lineRule="auto"/>
+        <w:rPr>
+          <w:rFonts w:ascii="Times New Roman" w:eastAsia="Times New Roman" w:hAnsi="Times New Roman" w:cs="Times New Roman"/>
+          <w:sz w:val="24"/>
+          <w:szCs w:val="24"/>
+          <w:lang w:bidi="ar-SA"/>
+        </w:rPr>
+      </w:pPr>
+      <w:r>
+        <w:rPr>
+          <w:rFonts w:ascii="Times New Roman" w:eastAsia="Times New Roman" w:hAnsi="Times New Roman" w:cs="Times New Roman"/>
+          <w:b/>
+          <w:bCs/>
+          <w:sz w:val="24"/>
+          <w:szCs w:val="24"/>
+          <w:lang w:bidi="ar-SA"/>
+        </w:rPr>
+        <w:t>Better Quality Software</w:t>
+      </w:r>
+    </w:p>
+    <w:p>
+      <w:pPr>
+        <w:numPr>
+          <w:ilvl w:val="1"/>
+          <w:numId w:val="19"/>
+        </w:numPr>
+        <w:spacing w:before="100" w:beforeAutospacing="1" w:after="100" w:afterAutospacing="1" w:line="240" w:lineRule="auto"/>
+        <w:rPr>
+          <w:rFonts w:ascii="Times New Roman" w:eastAsia="Times New Roman" w:hAnsi="Times New Roman" w:cs="Times New Roman"/>
+          <w:sz w:val="24"/>
+          <w:szCs w:val="24"/>
+          <w:lang w:bidi="ar-SA"/>
+        </w:rPr>
+      </w:pPr>
+      <w:r>
+        <w:rPr>
+          <w:rFonts w:ascii="Times New Roman" w:eastAsia="Times New Roman" w:hAnsi="Times New Roman" w:cs="Times New Roman"/>
+          <w:sz w:val="24"/>
+          <w:szCs w:val="24"/>
+          <w:lang w:bidi="ar-SA"/>
+        </w:rPr>
+        <w:t>Fewer bugs and errors</w:t>
+      </w:r>
+    </w:p>
+    <w:p>
+      <w:pPr>
+        <w:numPr>
+          <w:ilvl w:val="1"/>
+          <w:numId w:val="19"/>
+        </w:numPr>
+        <w:spacing w:before="100" w:beforeAutospacing="1" w:after="100" w:afterAutospacing="1" w:line="240" w:lineRule="auto"/>
+        <w:rPr>
+          <w:rFonts w:ascii="Times New Roman" w:eastAsia="Times New Roman" w:hAnsi="Times New Roman" w:cs="Times New Roman"/>
+          <w:sz w:val="24"/>
+          <w:szCs w:val="24"/>
+          <w:lang w:bidi="ar-SA"/>
+        </w:rPr>
+      </w:pPr>
+      <w:r>
+        <w:rPr>
+          <w:rFonts w:ascii="Times New Roman" w:eastAsia="Times New Roman" w:hAnsi="Times New Roman" w:cs="Times New Roman"/>
+          <w:sz w:val="24"/>
+          <w:szCs w:val="24"/>
+          <w:lang w:bidi="ar-SA"/>
+        </w:rPr>
+        <w:t>More reliable and stable systems</w:t>
       </w:r>
     </w:p>
     <w:p>
       <w:pPr>
         <w:numPr>
           <w:ilvl w:val="0"/>
-          <w:numId w:val="3"/>
+          <w:numId w:val="19"/>
         </w:numPr>
-        <w:spacing w:before="100" w:beforeAutospacing="1" w:after="0" w:line="240" w:lineRule="auto"/>
-        <w:rPr>
-          <w:rFonts w:ascii="Times New Roman" w:eastAsia="Times New Roman" w:hAnsi="Times New Roman" w:cs="Times New Roman"/>
-          <w:color w:val="1F1F1F"/>
-          <w:sz w:val="24"/>
-          <w:szCs w:val="24"/>
-          <w:lang w:bidi="ar-SA"/>
-        </w:rPr>
-      </w:pPr>
-      <w:r>
-        <w:rPr>
-          <w:rFonts w:ascii="Times New Roman" w:eastAsia="Times New Roman" w:hAnsi="Times New Roman" w:cs="Times New Roman"/>
-          <w:b/>
-          <w:bCs/>
-          <w:color w:val="1F1F1F"/>
-          <w:sz w:val="24"/>
-          <w:szCs w:val="24"/>
-          <w:bdr w:val="none" w:sz="0" w:space="0" w:color="auto" w:frame="1"/>
-          <w:lang w:bidi="ar-SA"/>
-        </w:rPr>
-        <w:t>Fit for Purpose</w:t>
-      </w:r>
-      <w:r>
-        <w:rPr>
-          <w:rFonts w:ascii="Times New Roman" w:eastAsia="Times New Roman" w:hAnsi="Times New Roman" w:cs="Times New Roman"/>
-          <w:color w:val="1F1F1F"/>
-          <w:sz w:val="24"/>
-          <w:szCs w:val="24"/>
-          <w:bdr w:val="none" w:sz="0" w:space="0" w:color="auto" w:frame="1"/>
-          <w:lang w:bidi="ar-SA"/>
-        </w:rPr>
-        <w:t xml:space="preserve"> (it does exactly what it's supposed to do).</w:t>
-      </w:r>
-    </w:p>
-    <w:p>
-      <w:pPr>
-        <w:spacing w:before="100" w:beforeAutospacing="1" w:after="120" w:line="240" w:lineRule="auto"/>
-        <w:outlineLvl w:val="2"/>
-        <w:rPr>
-          <w:rFonts w:ascii="Times New Roman" w:eastAsia="Times New Roman" w:hAnsi="Times New Roman" w:cs="Times New Roman"/>
-          <w:b/>
-          <w:bCs/>
-          <w:color w:val="1F1F1F"/>
-          <w:sz w:val="27"/>
-          <w:szCs w:val="27"/>
-          <w:lang w:bidi="ar-SA"/>
-        </w:rPr>
-      </w:pPr>
-      <w:r>
-        <w:rPr>
-          <w:rFonts w:ascii="Times New Roman" w:eastAsia="Times New Roman" w:hAnsi="Times New Roman" w:cs="Times New Roman"/>
-          <w:b/>
-          <w:bCs/>
-          <w:color w:val="1F1F1F"/>
-          <w:sz w:val="27"/>
-          <w:szCs w:val="27"/>
-          <w:lang w:bidi="ar-SA"/>
-        </w:rPr>
-        <w:t>4. Benefits of Improving the Process</w:t>
-      </w:r>
-    </w:p>
-    <w:p>
-      <w:pPr>
-        <w:spacing w:before="100" w:beforeAutospacing="1" w:after="0" w:line="240" w:lineRule="auto"/>
-        <w:rPr>
-          <w:rFonts w:ascii="Times New Roman" w:eastAsia="Times New Roman" w:hAnsi="Times New Roman" w:cs="Times New Roman"/>
-          <w:color w:val="1F1F1F"/>
-          <w:sz w:val="24"/>
-          <w:szCs w:val="24"/>
-          <w:lang w:bidi="ar-SA"/>
-        </w:rPr>
-      </w:pPr>
-      <w:r>
-        <w:rPr>
-          <w:rFonts w:ascii="Times New Roman" w:eastAsia="Times New Roman" w:hAnsi="Times New Roman" w:cs="Times New Roman"/>
-          <w:color w:val="1F1F1F"/>
-          <w:sz w:val="24"/>
-          <w:szCs w:val="24"/>
-          <w:bdr w:val="none" w:sz="0" w:space="0" w:color="auto" w:frame="1"/>
-          <w:lang w:bidi="ar-SA"/>
-        </w:rPr>
-        <w:t xml:space="preserve">Improving the </w:t>
-      </w:r>
-      <w:proofErr w:type="gramStart"/>
-      <w:r>
-        <w:rPr>
-          <w:rFonts w:ascii="Times New Roman" w:eastAsia="Times New Roman" w:hAnsi="Times New Roman" w:cs="Times New Roman"/>
-          <w:color w:val="1F1F1F"/>
-          <w:sz w:val="24"/>
-          <w:szCs w:val="24"/>
-          <w:bdr w:val="none" w:sz="0" w:space="0" w:color="auto" w:frame="1"/>
-          <w:lang w:bidi="ar-SA"/>
-        </w:rPr>
-        <w:t>way</w:t>
-      </w:r>
-      <w:proofErr w:type="gramEnd"/>
-      <w:r>
-        <w:rPr>
-          <w:rFonts w:ascii="Times New Roman" w:eastAsia="Times New Roman" w:hAnsi="Times New Roman" w:cs="Times New Roman"/>
-          <w:color w:val="1F1F1F"/>
-          <w:sz w:val="24"/>
-          <w:szCs w:val="24"/>
-          <w:bdr w:val="none" w:sz="0" w:space="0" w:color="auto" w:frame="1"/>
-          <w:lang w:bidi="ar-SA"/>
-        </w:rPr>
-        <w:t xml:space="preserve"> a company works leads to several positive outcomes:</w:t>
+        <w:spacing w:before="100" w:beforeAutospacing="1" w:after="100" w:afterAutospacing="1" w:line="240" w:lineRule="auto"/>
+        <w:rPr>
+          <w:rFonts w:ascii="Times New Roman" w:eastAsia="Times New Roman" w:hAnsi="Times New Roman" w:cs="Times New Roman"/>
+          <w:sz w:val="24"/>
+          <w:szCs w:val="24"/>
+          <w:lang w:bidi="ar-SA"/>
+        </w:rPr>
+      </w:pPr>
+      <w:r>
+        <w:rPr>
+          <w:rFonts w:ascii="Times New Roman" w:eastAsia="Times New Roman" w:hAnsi="Times New Roman" w:cs="Times New Roman"/>
+          <w:b/>
+          <w:bCs/>
+          <w:sz w:val="24"/>
+          <w:szCs w:val="24"/>
+          <w:lang w:bidi="ar-SA"/>
+        </w:rPr>
+        <w:t>Increased Productivity</w:t>
+      </w:r>
+    </w:p>
+    <w:p>
+      <w:pPr>
+        <w:numPr>
+          <w:ilvl w:val="1"/>
+          <w:numId w:val="19"/>
+        </w:numPr>
+        <w:spacing w:before="100" w:beforeAutospacing="1" w:after="100" w:afterAutospacing="1" w:line="240" w:lineRule="auto"/>
+        <w:rPr>
+          <w:rFonts w:ascii="Times New Roman" w:eastAsia="Times New Roman" w:hAnsi="Times New Roman" w:cs="Times New Roman"/>
+          <w:sz w:val="24"/>
+          <w:szCs w:val="24"/>
+          <w:lang w:bidi="ar-SA"/>
+        </w:rPr>
+      </w:pPr>
+      <w:r>
+        <w:rPr>
+          <w:rFonts w:ascii="Times New Roman" w:eastAsia="Times New Roman" w:hAnsi="Times New Roman" w:cs="Times New Roman"/>
+          <w:sz w:val="24"/>
+          <w:szCs w:val="24"/>
+          <w:lang w:bidi="ar-SA"/>
+        </w:rPr>
+        <w:t>Teams work faster and more efficiently</w:t>
+      </w:r>
+    </w:p>
+    <w:p>
+      <w:pPr>
+        <w:numPr>
+          <w:ilvl w:val="1"/>
+          <w:numId w:val="19"/>
+        </w:numPr>
+        <w:spacing w:before="100" w:beforeAutospacing="1" w:after="100" w:afterAutospacing="1" w:line="240" w:lineRule="auto"/>
+        <w:rPr>
+          <w:rFonts w:ascii="Times New Roman" w:eastAsia="Times New Roman" w:hAnsi="Times New Roman" w:cs="Times New Roman"/>
+          <w:sz w:val="24"/>
+          <w:szCs w:val="24"/>
+          <w:lang w:bidi="ar-SA"/>
+        </w:rPr>
+      </w:pPr>
+      <w:r>
+        <w:rPr>
+          <w:rFonts w:ascii="Times New Roman" w:eastAsia="Times New Roman" w:hAnsi="Times New Roman" w:cs="Times New Roman"/>
+          <w:sz w:val="24"/>
+          <w:szCs w:val="24"/>
+          <w:lang w:bidi="ar-SA"/>
+        </w:rPr>
+        <w:t>Less time wasted on fixing mistakes</w:t>
       </w:r>
     </w:p>
     <w:p>
       <w:pPr>
         <w:numPr>
           <w:ilvl w:val="0"/>
-          <w:numId w:val="4"/>
+          <w:numId w:val="19"/>
         </w:numPr>
-        <w:spacing w:before="100" w:beforeAutospacing="1" w:after="0" w:line="240" w:lineRule="auto"/>
-        <w:rPr>
-          <w:rFonts w:ascii="Times New Roman" w:eastAsia="Times New Roman" w:hAnsi="Times New Roman" w:cs="Times New Roman"/>
-          <w:color w:val="1F1F1F"/>
-          <w:sz w:val="24"/>
-          <w:szCs w:val="24"/>
-          <w:lang w:bidi="ar-SA"/>
-        </w:rPr>
-      </w:pPr>
-      <w:r>
-        <w:rPr>
-          <w:rFonts w:ascii="Times New Roman" w:eastAsia="Times New Roman" w:hAnsi="Times New Roman" w:cs="Times New Roman"/>
-          <w:b/>
-          <w:bCs/>
-          <w:color w:val="1F1F1F"/>
-          <w:sz w:val="24"/>
-          <w:szCs w:val="24"/>
-          <w:bdr w:val="none" w:sz="0" w:space="0" w:color="auto" w:frame="1"/>
-          <w:lang w:bidi="ar-SA"/>
-        </w:rPr>
-        <w:t>Better Quality &amp; Less Waste:</w:t>
-      </w:r>
-      <w:r>
-        <w:rPr>
-          <w:rFonts w:ascii="Times New Roman" w:eastAsia="Times New Roman" w:hAnsi="Times New Roman" w:cs="Times New Roman"/>
-          <w:color w:val="1F1F1F"/>
-          <w:sz w:val="24"/>
-          <w:szCs w:val="24"/>
-          <w:bdr w:val="none" w:sz="0" w:space="0" w:color="auto" w:frame="1"/>
-          <w:lang w:bidi="ar-SA"/>
-        </w:rPr>
-        <w:t xml:space="preserve"> It reduces the "cost of poor quality" and helps remove unnecessary steps (waste) from the workflow.</w:t>
+        <w:spacing w:before="100" w:beforeAutospacing="1" w:after="100" w:afterAutospacing="1" w:line="240" w:lineRule="auto"/>
+        <w:rPr>
+          <w:rFonts w:ascii="Times New Roman" w:eastAsia="Times New Roman" w:hAnsi="Times New Roman" w:cs="Times New Roman"/>
+          <w:sz w:val="24"/>
+          <w:szCs w:val="24"/>
+          <w:lang w:bidi="ar-SA"/>
+        </w:rPr>
+      </w:pPr>
+      <w:r>
+        <w:rPr>
+          <w:rFonts w:ascii="Times New Roman" w:eastAsia="Times New Roman" w:hAnsi="Times New Roman" w:cs="Times New Roman"/>
+          <w:b/>
+          <w:bCs/>
+          <w:sz w:val="24"/>
+          <w:szCs w:val="24"/>
+          <w:lang w:bidi="ar-SA"/>
+        </w:rPr>
+        <w:t>Cost Reduction</w:t>
+      </w:r>
+    </w:p>
+    <w:p>
+      <w:pPr>
+        <w:numPr>
+          <w:ilvl w:val="1"/>
+          <w:numId w:val="19"/>
+        </w:numPr>
+        <w:spacing w:before="100" w:beforeAutospacing="1" w:after="100" w:afterAutospacing="1" w:line="240" w:lineRule="auto"/>
+        <w:rPr>
+          <w:rFonts w:ascii="Times New Roman" w:eastAsia="Times New Roman" w:hAnsi="Times New Roman" w:cs="Times New Roman"/>
+          <w:sz w:val="24"/>
+          <w:szCs w:val="24"/>
+          <w:lang w:bidi="ar-SA"/>
+        </w:rPr>
+      </w:pPr>
+      <w:r>
+        <w:rPr>
+          <w:rFonts w:ascii="Times New Roman" w:eastAsia="Times New Roman" w:hAnsi="Times New Roman" w:cs="Times New Roman"/>
+          <w:sz w:val="24"/>
+          <w:szCs w:val="24"/>
+          <w:lang w:bidi="ar-SA"/>
+        </w:rPr>
+        <w:t>Early detection of problems saves money</w:t>
+      </w:r>
+    </w:p>
+    <w:p>
+      <w:pPr>
+        <w:numPr>
+          <w:ilvl w:val="1"/>
+          <w:numId w:val="19"/>
+        </w:numPr>
+        <w:spacing w:before="100" w:beforeAutospacing="1" w:after="100" w:afterAutospacing="1" w:line="240" w:lineRule="auto"/>
+        <w:rPr>
+          <w:rFonts w:ascii="Times New Roman" w:eastAsia="Times New Roman" w:hAnsi="Times New Roman" w:cs="Times New Roman"/>
+          <w:sz w:val="24"/>
+          <w:szCs w:val="24"/>
+          <w:lang w:bidi="ar-SA"/>
+        </w:rPr>
+      </w:pPr>
+      <w:r>
+        <w:rPr>
+          <w:rFonts w:ascii="Times New Roman" w:eastAsia="Times New Roman" w:hAnsi="Times New Roman" w:cs="Times New Roman"/>
+          <w:sz w:val="24"/>
+          <w:szCs w:val="24"/>
+          <w:lang w:bidi="ar-SA"/>
+        </w:rPr>
+        <w:t>Less rework needed</w:t>
       </w:r>
     </w:p>
     <w:p>
       <w:pPr>
         <w:numPr>
           <w:ilvl w:val="0"/>
-          <w:numId w:val="4"/>
+          <w:numId w:val="19"/>
         </w:numPr>
-        <w:spacing w:before="100" w:beforeAutospacing="1" w:after="0" w:line="240" w:lineRule="auto"/>
-        <w:rPr>
-          <w:rFonts w:ascii="Times New Roman" w:eastAsia="Times New Roman" w:hAnsi="Times New Roman" w:cs="Times New Roman"/>
-          <w:color w:val="1F1F1F"/>
-          <w:sz w:val="24"/>
-          <w:szCs w:val="24"/>
-          <w:lang w:bidi="ar-SA"/>
-        </w:rPr>
-      </w:pPr>
-      <w:r>
-        <w:rPr>
-          <w:rFonts w:ascii="Times New Roman" w:eastAsia="Times New Roman" w:hAnsi="Times New Roman" w:cs="Times New Roman"/>
-          <w:b/>
-          <w:bCs/>
-          <w:color w:val="1F1F1F"/>
-          <w:sz w:val="24"/>
-          <w:szCs w:val="24"/>
-          <w:bdr w:val="none" w:sz="0" w:space="0" w:color="auto" w:frame="1"/>
-          <w:lang w:bidi="ar-SA"/>
-        </w:rPr>
-        <w:t>Efficiency:</w:t>
-      </w:r>
-      <w:r>
-        <w:rPr>
-          <w:rFonts w:ascii="Times New Roman" w:eastAsia="Times New Roman" w:hAnsi="Times New Roman" w:cs="Times New Roman"/>
-          <w:color w:val="1F1F1F"/>
-          <w:sz w:val="24"/>
-          <w:szCs w:val="24"/>
-          <w:bdr w:val="none" w:sz="0" w:space="0" w:color="auto" w:frame="1"/>
-          <w:lang w:bidi="ar-SA"/>
-        </w:rPr>
-        <w:t xml:space="preserve"> It improves productivity and helps projects stay on budget and on schedule.</w:t>
+        <w:spacing w:before="100" w:beforeAutospacing="1" w:after="100" w:afterAutospacing="1" w:line="240" w:lineRule="auto"/>
+        <w:rPr>
+          <w:rFonts w:ascii="Times New Roman" w:eastAsia="Times New Roman" w:hAnsi="Times New Roman" w:cs="Times New Roman"/>
+          <w:sz w:val="24"/>
+          <w:szCs w:val="24"/>
+          <w:lang w:bidi="ar-SA"/>
+        </w:rPr>
+      </w:pPr>
+      <w:r>
+        <w:rPr>
+          <w:rFonts w:ascii="Times New Roman" w:eastAsia="Times New Roman" w:hAnsi="Times New Roman" w:cs="Times New Roman"/>
+          <w:b/>
+          <w:bCs/>
+          <w:sz w:val="24"/>
+          <w:szCs w:val="24"/>
+          <w:lang w:bidi="ar-SA"/>
+        </w:rPr>
+        <w:t>Improved Customer Satisfaction</w:t>
+      </w:r>
+    </w:p>
+    <w:p>
+      <w:pPr>
+        <w:numPr>
+          <w:ilvl w:val="1"/>
+          <w:numId w:val="19"/>
+        </w:numPr>
+        <w:spacing w:before="100" w:beforeAutospacing="1" w:after="100" w:afterAutospacing="1" w:line="240" w:lineRule="auto"/>
+        <w:rPr>
+          <w:rFonts w:ascii="Times New Roman" w:eastAsia="Times New Roman" w:hAnsi="Times New Roman" w:cs="Times New Roman"/>
+          <w:sz w:val="24"/>
+          <w:szCs w:val="24"/>
+          <w:lang w:bidi="ar-SA"/>
+        </w:rPr>
+      </w:pPr>
+      <w:r>
+        <w:rPr>
+          <w:rFonts w:ascii="Times New Roman" w:eastAsia="Times New Roman" w:hAnsi="Times New Roman" w:cs="Times New Roman"/>
+          <w:sz w:val="24"/>
+          <w:szCs w:val="24"/>
+          <w:lang w:bidi="ar-SA"/>
+        </w:rPr>
+        <w:t>Deliver software on time</w:t>
+      </w:r>
+    </w:p>
+    <w:p>
+      <w:pPr>
+        <w:numPr>
+          <w:ilvl w:val="1"/>
+          <w:numId w:val="19"/>
+        </w:numPr>
+        <w:spacing w:before="100" w:beforeAutospacing="1" w:after="100" w:afterAutospacing="1" w:line="240" w:lineRule="auto"/>
+        <w:rPr>
+          <w:rFonts w:ascii="Times New Roman" w:eastAsia="Times New Roman" w:hAnsi="Times New Roman" w:cs="Times New Roman"/>
+          <w:sz w:val="24"/>
+          <w:szCs w:val="24"/>
+          <w:lang w:bidi="ar-SA"/>
+        </w:rPr>
+      </w:pPr>
+      <w:r>
+        <w:rPr>
+          <w:rFonts w:ascii="Times New Roman" w:eastAsia="Times New Roman" w:hAnsi="Times New Roman" w:cs="Times New Roman"/>
+          <w:sz w:val="24"/>
+          <w:szCs w:val="24"/>
+          <w:lang w:bidi="ar-SA"/>
+        </w:rPr>
+        <w:t>Meet user requirements better</w:t>
       </w:r>
     </w:p>
     <w:p>
       <w:pPr>
         <w:numPr>
           <w:ilvl w:val="0"/>
-          <w:numId w:val="4"/>
+          <w:numId w:val="19"/>
         </w:numPr>
-        <w:spacing w:before="100" w:beforeAutospacing="1" w:after="0" w:line="240" w:lineRule="auto"/>
-        <w:rPr>
-          <w:rFonts w:ascii="Times New Roman" w:eastAsia="Times New Roman" w:hAnsi="Times New Roman" w:cs="Times New Roman"/>
-          <w:color w:val="1F1F1F"/>
-          <w:sz w:val="24"/>
-          <w:szCs w:val="24"/>
-          <w:lang w:bidi="ar-SA"/>
-        </w:rPr>
-      </w:pPr>
-      <w:r>
-        <w:rPr>
-          <w:rFonts w:ascii="Times New Roman" w:eastAsia="Times New Roman" w:hAnsi="Times New Roman" w:cs="Times New Roman"/>
-          <w:b/>
-          <w:bCs/>
-          <w:color w:val="1F1F1F"/>
-          <w:sz w:val="24"/>
-          <w:szCs w:val="24"/>
-          <w:bdr w:val="none" w:sz="0" w:space="0" w:color="auto" w:frame="1"/>
-          <w:lang w:bidi="ar-SA"/>
-        </w:rPr>
-        <w:t>Happier People:</w:t>
-      </w:r>
-      <w:r>
-        <w:rPr>
-          <w:rFonts w:ascii="Times New Roman" w:eastAsia="Times New Roman" w:hAnsi="Times New Roman" w:cs="Times New Roman"/>
-          <w:color w:val="1F1F1F"/>
-          <w:sz w:val="24"/>
-          <w:szCs w:val="24"/>
-          <w:bdr w:val="none" w:sz="0" w:space="0" w:color="auto" w:frame="1"/>
-          <w:lang w:bidi="ar-SA"/>
-        </w:rPr>
-        <w:t xml:space="preserve"> Customers are more satisfied with the final product, and employees are happier working in an environment where their work is effective and adds value.</w:t>
+        <w:spacing w:before="100" w:beforeAutospacing="1" w:after="100" w:afterAutospacing="1" w:line="240" w:lineRule="auto"/>
+        <w:rPr>
+          <w:rFonts w:ascii="Times New Roman" w:eastAsia="Times New Roman" w:hAnsi="Times New Roman" w:cs="Times New Roman"/>
+          <w:sz w:val="24"/>
+          <w:szCs w:val="24"/>
+          <w:lang w:bidi="ar-SA"/>
+        </w:rPr>
+      </w:pPr>
+      <w:r>
+        <w:rPr>
+          <w:rFonts w:ascii="Times New Roman" w:eastAsia="Times New Roman" w:hAnsi="Times New Roman" w:cs="Times New Roman"/>
+          <w:b/>
+          <w:bCs/>
+          <w:sz w:val="24"/>
+          <w:szCs w:val="24"/>
+          <w:lang w:bidi="ar-SA"/>
+        </w:rPr>
+        <w:t>Better Project Control</w:t>
+      </w:r>
+    </w:p>
+    <w:p>
+      <w:pPr>
+        <w:numPr>
+          <w:ilvl w:val="1"/>
+          <w:numId w:val="19"/>
+        </w:numPr>
+        <w:spacing w:before="100" w:beforeAutospacing="1" w:after="100" w:afterAutospacing="1" w:line="240" w:lineRule="auto"/>
+        <w:rPr>
+          <w:rFonts w:ascii="Times New Roman" w:eastAsia="Times New Roman" w:hAnsi="Times New Roman" w:cs="Times New Roman"/>
+          <w:sz w:val="24"/>
+          <w:szCs w:val="24"/>
+          <w:lang w:bidi="ar-SA"/>
+        </w:rPr>
+      </w:pPr>
+      <w:r>
+        <w:rPr>
+          <w:rFonts w:ascii="Times New Roman" w:eastAsia="Times New Roman" w:hAnsi="Times New Roman" w:cs="Times New Roman"/>
+          <w:sz w:val="24"/>
+          <w:szCs w:val="24"/>
+          <w:lang w:bidi="ar-SA"/>
+        </w:rPr>
+        <w:t>Easier planning, tracking, and management</w:t>
+      </w:r>
+    </w:p>
+    <w:p>
+      <w:pPr>
+        <w:numPr>
+          <w:ilvl w:val="1"/>
+          <w:numId w:val="19"/>
+        </w:numPr>
+        <w:spacing w:before="100" w:beforeAutospacing="1" w:after="100" w:afterAutospacing="1" w:line="240" w:lineRule="auto"/>
+        <w:rPr>
+          <w:rFonts w:ascii="Times New Roman" w:eastAsia="Times New Roman" w:hAnsi="Times New Roman" w:cs="Times New Roman"/>
+          <w:sz w:val="24"/>
+          <w:szCs w:val="24"/>
+          <w:lang w:bidi="ar-SA"/>
+        </w:rPr>
+      </w:pPr>
+      <w:r>
+        <w:rPr>
+          <w:rFonts w:ascii="Times New Roman" w:eastAsia="Times New Roman" w:hAnsi="Times New Roman" w:cs="Times New Roman"/>
+          <w:sz w:val="24"/>
+          <w:szCs w:val="24"/>
+          <w:lang w:bidi="ar-SA"/>
+        </w:rPr>
+        <w:t>Clear processes reduce confusion</w:t>
+      </w:r>
+      <w:r>
+        <w:rPr>
+          <w:rFonts w:ascii="Times New Roman" w:eastAsia="Times New Roman" w:hAnsi="Times New Roman" w:cs="Times New Roman"/>
+          <w:sz w:val="24"/>
+          <w:szCs w:val="24"/>
+          <w:lang w:bidi="ar-SA"/>
+        </w:rPr>
+        <w:t xml:space="preserve">    </w:t>
       </w:r>
     </w:p>
     <w:p>
       <w:pPr>
         <w:numPr>
           <w:ilvl w:val="0"/>
-          <w:numId w:val="4"/>
+          <w:numId w:val="19"/>
         </w:numPr>
-        <w:spacing w:before="100" w:beforeAutospacing="1" w:after="0" w:line="240" w:lineRule="auto"/>
-        <w:rPr>
-          <w:rFonts w:ascii="Times New Roman" w:eastAsia="Times New Roman" w:hAnsi="Times New Roman" w:cs="Times New Roman"/>
-          <w:color w:val="1F1F1F"/>
-          <w:sz w:val="24"/>
-          <w:szCs w:val="24"/>
-          <w:lang w:bidi="ar-SA"/>
-        </w:rPr>
-      </w:pPr>
-      <w:r>
-        <w:rPr>
-          <w:rFonts w:ascii="Times New Roman" w:eastAsia="Times New Roman" w:hAnsi="Times New Roman" w:cs="Times New Roman"/>
-          <w:b/>
-          <w:bCs/>
-          <w:color w:val="1F1F1F"/>
-          <w:sz w:val="24"/>
-          <w:szCs w:val="24"/>
-          <w:bdr w:val="none" w:sz="0" w:space="0" w:color="auto" w:frame="1"/>
-          <w:lang w:bidi="ar-SA"/>
-        </w:rPr>
-        <w:t>Innovation:</w:t>
-      </w:r>
-      <w:r>
-        <w:rPr>
-          <w:rFonts w:ascii="Times New Roman" w:eastAsia="Times New Roman" w:hAnsi="Times New Roman" w:cs="Times New Roman"/>
-          <w:color w:val="1F1F1F"/>
-          <w:sz w:val="24"/>
-          <w:szCs w:val="24"/>
-          <w:bdr w:val="none" w:sz="0" w:space="0" w:color="auto" w:frame="1"/>
-          <w:lang w:bidi="ar-SA"/>
-        </w:rPr>
-        <w:t xml:space="preserve"> It keeps a company "fresh" and agile, allowing it to grow and change easily.</w:t>
-      </w:r>
-    </w:p>
-    <w:p>
+        <w:spacing w:before="100" w:beforeAutospacing="1" w:after="100" w:afterAutospacing="1" w:line="240" w:lineRule="auto"/>
+        <w:rPr>
+          <w:rFonts w:ascii="Times New Roman" w:eastAsia="Times New Roman" w:hAnsi="Times New Roman" w:cs="Times New Roman"/>
+          <w:sz w:val="24"/>
+          <w:szCs w:val="24"/>
+          <w:lang w:bidi="ar-SA"/>
+        </w:rPr>
+      </w:pPr>
+      <w:r>
+        <w:rPr>
+          <w:rFonts w:ascii="Times New Roman" w:eastAsia="Times New Roman" w:hAnsi="Times New Roman" w:cs="Times New Roman"/>
+          <w:b/>
+          <w:bCs/>
+          <w:sz w:val="24"/>
+          <w:szCs w:val="24"/>
+          <w:lang w:bidi="ar-SA"/>
+        </w:rPr>
+        <w:t>Continuous Improvement</w:t>
+      </w:r>
+    </w:p>
+    <w:p>
+      <w:pPr>
+        <w:numPr>
+          <w:ilvl w:val="1"/>
+          <w:numId w:val="19"/>
+        </w:numPr>
+        <w:spacing w:before="100" w:beforeAutospacing="1" w:after="100" w:afterAutospacing="1" w:line="240" w:lineRule="auto"/>
+        <w:rPr>
+          <w:rFonts w:ascii="Times New Roman" w:eastAsia="Times New Roman" w:hAnsi="Times New Roman" w:cs="Times New Roman"/>
+          <w:sz w:val="24"/>
+          <w:szCs w:val="24"/>
+          <w:lang w:bidi="ar-SA"/>
+        </w:rPr>
+      </w:pPr>
+      <w:r>
+        <w:rPr>
+          <w:rFonts w:ascii="Times New Roman" w:eastAsia="Times New Roman" w:hAnsi="Times New Roman" w:cs="Times New Roman"/>
+          <w:sz w:val="24"/>
+          <w:szCs w:val="24"/>
+          <w:lang w:bidi="ar-SA"/>
+        </w:rPr>
+        <w:t>Teams keep learning and improving over time</w:t>
+      </w:r>
+    </w:p>
+    <w:p>
+      <w:pPr>
+        <w:numPr>
+          <w:ilvl w:val="1"/>
+          <w:numId w:val="19"/>
+        </w:numPr>
+        <w:spacing w:before="100" w:beforeAutospacing="1" w:after="100" w:afterAutospacing="1" w:line="240" w:lineRule="auto"/>
+        <w:rPr>
+          <w:rFonts w:ascii="Times New Roman" w:eastAsia="Times New Roman" w:hAnsi="Times New Roman" w:cs="Times New Roman"/>
+          <w:sz w:val="24"/>
+          <w:szCs w:val="24"/>
+          <w:lang w:bidi="ar-SA"/>
+        </w:rPr>
+      </w:pPr>
+      <w:r>
+        <w:rPr>
+          <w:rFonts w:ascii="Times New Roman" w:eastAsia="Times New Roman" w:hAnsi="Times New Roman" w:cs="Times New Roman"/>
+          <w:sz w:val="24"/>
+          <w:szCs w:val="24"/>
+          <w:lang w:bidi="ar-SA"/>
+        </w:rPr>
+        <w:t>Helps organizations stay competitive</w:t>
+      </w:r>
       <w:r>
         <w:br w:type="page"/>
       </w:r>
     </w:p>
+    <w:p/>
     <w:p>
       <w:pPr>
         <w:jc w:val="center"/>
@@ -714,7 +950,6 @@
           <w:sz w:val="26"/>
           <w:szCs w:val="26"/>
         </w:rPr>
-        <w:lastRenderedPageBreak/>
         <w:t>Lean, SE Wastes, Value Add vs Non-Value Add</w:t>
       </w:r>
     </w:p>
@@ -747,10 +982,7 @@
         <w:t xml:space="preserve"> </w:t>
       </w:r>
       <w:r>
-        <w:t>improving efficiency, and continuously improving the development</w:t>
-      </w:r>
-      <w:r>
-        <w:t xml:space="preserve"> process</w:t>
+        <w:t>improving efficiency, and continuously improving the development process</w:t>
       </w:r>
       <w:r>
         <w:rPr>
@@ -1432,6 +1664,7 @@
           <w:szCs w:val="27"/>
           <w:lang w:bidi="ar-SA"/>
         </w:rPr>
+        <w:lastRenderedPageBreak/>
         <w:t>2. Defect</w:t>
       </w:r>
     </w:p>
@@ -1454,7 +1687,6 @@
           <w:szCs w:val="24"/>
           <w:lang w:bidi="ar-SA"/>
         </w:rPr>
-        <w:lastRenderedPageBreak/>
         <w:t>A defect is a bug or an error in the software. This is a major waste because it means the product is not working as the customer expects.</w:t>
       </w:r>
     </w:p>
@@ -4549,8 +4781,716 @@
     </w:p>
     <w:p>
       <w:pPr>
+        <w:rPr>
+          <w:rFonts w:asciiTheme="majorBidi" w:hAnsiTheme="majorBidi" w:cstheme="majorBidi"/>
+          <w:b/>
+          <w:bCs/>
+          <w:sz w:val="24"/>
+          <w:szCs w:val="24"/>
+        </w:rPr>
+      </w:pPr>
+      <w:r>
+        <w:rPr>
+          <w:rFonts w:asciiTheme="majorBidi" w:hAnsiTheme="majorBidi" w:cstheme="majorBidi"/>
+          <w:b/>
+          <w:bCs/>
+          <w:sz w:val="24"/>
+          <w:szCs w:val="24"/>
+        </w:rPr>
+        <w:br w:type="page"/>
+      </w:r>
+    </w:p>
+    <w:p>
+      <w:pPr>
         <w:spacing w:after="0"/>
-        <w:jc w:val="both"/>
+        <w:jc w:val="center"/>
+        <w:rPr>
+          <w:rFonts w:asciiTheme="majorBidi" w:hAnsiTheme="majorBidi" w:cstheme="majorBidi"/>
+          <w:b/>
+          <w:bCs/>
+          <w:sz w:val="24"/>
+          <w:szCs w:val="24"/>
+        </w:rPr>
+      </w:pPr>
+      <w:r>
+        <w:rPr>
+          <w:rFonts w:asciiTheme="majorBidi" w:hAnsiTheme="majorBidi" w:cstheme="majorBidi"/>
+          <w:b/>
+          <w:bCs/>
+          <w:sz w:val="24"/>
+          <w:szCs w:val="24"/>
+        </w:rPr>
+        <w:lastRenderedPageBreak/>
+        <w:t>Software Process Improvement Generic Framework</w:t>
+      </w:r>
+    </w:p>
+    <w:p>
+      <w:pPr>
+        <w:spacing w:after="0"/>
+        <w:rPr>
+          <w:rFonts w:asciiTheme="majorBidi" w:hAnsiTheme="majorBidi" w:cstheme="majorBidi"/>
+          <w:b/>
+          <w:bCs/>
+          <w:sz w:val="24"/>
+          <w:szCs w:val="24"/>
+        </w:rPr>
+      </w:pPr>
+    </w:p>
+    <w:p>
+      <w:pPr>
+        <w:spacing w:after="0"/>
+        <w:rPr>
+          <w:rStyle w:val="citation-55"/>
+          <w:rFonts w:asciiTheme="majorBidi" w:hAnsiTheme="majorBidi" w:cstheme="majorBidi"/>
+          <w:sz w:val="24"/>
+          <w:szCs w:val="24"/>
+        </w:rPr>
+      </w:pPr>
+      <w:r>
+        <w:rPr>
+          <w:rStyle w:val="citation-55"/>
+          <w:rFonts w:asciiTheme="majorBidi" w:hAnsiTheme="majorBidi" w:cstheme="majorBidi"/>
+          <w:b/>
+          <w:bCs/>
+          <w:sz w:val="24"/>
+          <w:szCs w:val="24"/>
+        </w:rPr>
+        <w:t>Software Process Improvement (SPI) Framework</w:t>
+      </w:r>
+      <w:r>
+        <w:rPr>
+          <w:rStyle w:val="citation-55"/>
+          <w:rFonts w:asciiTheme="majorBidi" w:hAnsiTheme="majorBidi" w:cstheme="majorBidi"/>
+          <w:sz w:val="24"/>
+          <w:szCs w:val="24"/>
+        </w:rPr>
+        <w:t xml:space="preserve"> is a structured approach organizations use to enhance the quality and efficiency of their software development processes</w:t>
+      </w:r>
+      <w:r>
+        <w:rPr>
+          <w:rStyle w:val="citation-55"/>
+          <w:rFonts w:asciiTheme="majorBidi" w:hAnsiTheme="majorBidi" w:cstheme="majorBidi"/>
+          <w:sz w:val="24"/>
+          <w:szCs w:val="24"/>
+        </w:rPr>
+        <w:t>.</w:t>
+      </w:r>
+    </w:p>
+    <w:p>
+      <w:pPr>
+        <w:spacing w:after="0"/>
+        <w:rPr>
+          <w:rStyle w:val="citation-55"/>
+          <w:rFonts w:asciiTheme="majorBidi" w:hAnsiTheme="majorBidi" w:cstheme="majorBidi"/>
+          <w:sz w:val="24"/>
+          <w:szCs w:val="24"/>
+        </w:rPr>
+      </w:pPr>
+    </w:p>
+    <w:p>
+      <w:pPr>
+        <w:spacing w:after="0"/>
+        <w:rPr>
+          <w:rStyle w:val="citation-55"/>
+          <w:rFonts w:asciiTheme="majorBidi" w:hAnsiTheme="majorBidi" w:cstheme="majorBidi"/>
+          <w:b/>
+          <w:bCs/>
+          <w:sz w:val="24"/>
+          <w:szCs w:val="24"/>
+        </w:rPr>
+      </w:pPr>
+      <w:r>
+        <w:rPr>
+          <w:rFonts w:asciiTheme="majorBidi" w:hAnsiTheme="majorBidi" w:cstheme="majorBidi"/>
+          <w:b/>
+          <w:bCs/>
+          <w:sz w:val="24"/>
+          <w:szCs w:val="24"/>
+        </w:rPr>
+        <w:t>A</w:t>
+      </w:r>
+      <w:r>
+        <w:rPr>
+          <w:rFonts w:asciiTheme="majorBidi" w:hAnsiTheme="majorBidi" w:cstheme="majorBidi"/>
+          <w:b/>
+          <w:bCs/>
+          <w:sz w:val="24"/>
+          <w:szCs w:val="24"/>
+        </w:rPr>
+        <w:t>ssessment</w:t>
+      </w:r>
+      <w:r>
+        <w:rPr>
+          <w:rFonts w:asciiTheme="majorBidi" w:hAnsiTheme="majorBidi" w:cstheme="majorBidi"/>
+          <w:b/>
+          <w:bCs/>
+          <w:sz w:val="24"/>
+          <w:szCs w:val="24"/>
+        </w:rPr>
+        <w:t>:</w:t>
+      </w:r>
+    </w:p>
+    <w:p>
+      <w:pPr>
+        <w:spacing w:after="0"/>
+        <w:rPr>
+          <w:rFonts w:asciiTheme="majorBidi" w:hAnsiTheme="majorBidi" w:cstheme="majorBidi"/>
+          <w:sz w:val="24"/>
+          <w:szCs w:val="24"/>
+        </w:rPr>
+      </w:pPr>
+      <w:r>
+        <w:rPr>
+          <w:rFonts w:asciiTheme="majorBidi" w:hAnsiTheme="majorBidi" w:cstheme="majorBidi"/>
+          <w:sz w:val="24"/>
+          <w:szCs w:val="24"/>
+        </w:rPr>
+        <w:t>Software process used by an organization is first examined through an assessment. The assessment analyzes how the process is performed and helps identify its strengths, weaknesses, and maturity level.</w:t>
+      </w:r>
+    </w:p>
+    <w:p>
+      <w:pPr>
+        <w:spacing w:after="0"/>
+        <w:rPr>
+          <w:rFonts w:asciiTheme="majorBidi" w:hAnsiTheme="majorBidi" w:cstheme="majorBidi"/>
+          <w:b/>
+          <w:bCs/>
+          <w:sz w:val="24"/>
+          <w:szCs w:val="24"/>
+        </w:rPr>
+      </w:pPr>
+      <w:r>
+        <w:rPr>
+          <w:rFonts w:asciiTheme="majorBidi" w:hAnsiTheme="majorBidi" w:cstheme="majorBidi"/>
+          <w:b/>
+          <w:bCs/>
+          <w:sz w:val="24"/>
+          <w:szCs w:val="24"/>
+        </w:rPr>
+        <w:t>C</w:t>
+      </w:r>
+      <w:r>
+        <w:rPr>
+          <w:rFonts w:asciiTheme="majorBidi" w:hAnsiTheme="majorBidi" w:cstheme="majorBidi"/>
+          <w:b/>
+          <w:bCs/>
+          <w:sz w:val="24"/>
+          <w:szCs w:val="24"/>
+        </w:rPr>
+        <w:t>apability determination</w:t>
+      </w:r>
+      <w:r>
+        <w:rPr>
+          <w:rFonts w:asciiTheme="majorBidi" w:hAnsiTheme="majorBidi" w:cstheme="majorBidi"/>
+          <w:b/>
+          <w:bCs/>
+          <w:sz w:val="24"/>
+          <w:szCs w:val="24"/>
+        </w:rPr>
+        <w:t>:</w:t>
+      </w:r>
+    </w:p>
+    <w:p>
+      <w:pPr>
+        <w:spacing w:after="0"/>
+        <w:rPr>
+          <w:rFonts w:asciiTheme="majorBidi" w:hAnsiTheme="majorBidi" w:cstheme="majorBidi"/>
+          <w:sz w:val="24"/>
+          <w:szCs w:val="24"/>
+        </w:rPr>
+      </w:pPr>
+      <w:r>
+        <w:rPr>
+          <w:rFonts w:asciiTheme="majorBidi" w:hAnsiTheme="majorBidi" w:cstheme="majorBidi"/>
+          <w:sz w:val="24"/>
+          <w:szCs w:val="24"/>
+        </w:rPr>
+        <w:t>Based on the assessment results, capability determination is conducted to evaluate the organization's ability to effectively perform software development activities and determine the maturity of the process.</w:t>
+      </w:r>
+    </w:p>
+    <w:p>
+      <w:pPr>
+        <w:spacing w:after="0"/>
+        <w:rPr>
+          <w:rFonts w:asciiTheme="majorBidi" w:hAnsiTheme="majorBidi" w:cstheme="majorBidi"/>
+          <w:b/>
+          <w:bCs/>
+          <w:sz w:val="24"/>
+          <w:szCs w:val="24"/>
+        </w:rPr>
+      </w:pPr>
+      <w:r>
+        <w:rPr>
+          <w:rFonts w:asciiTheme="majorBidi" w:hAnsiTheme="majorBidi" w:cstheme="majorBidi"/>
+          <w:b/>
+          <w:bCs/>
+          <w:sz w:val="24"/>
+          <w:szCs w:val="24"/>
+        </w:rPr>
+        <w:t>I</w:t>
+      </w:r>
+      <w:r>
+        <w:rPr>
+          <w:rFonts w:asciiTheme="majorBidi" w:hAnsiTheme="majorBidi" w:cstheme="majorBidi"/>
+          <w:b/>
+          <w:bCs/>
+          <w:sz w:val="24"/>
+          <w:szCs w:val="24"/>
+        </w:rPr>
+        <w:t>mprovement strategy</w:t>
+      </w:r>
+      <w:r>
+        <w:rPr>
+          <w:rFonts w:asciiTheme="majorBidi" w:hAnsiTheme="majorBidi" w:cstheme="majorBidi"/>
+          <w:b/>
+          <w:bCs/>
+          <w:sz w:val="24"/>
+          <w:szCs w:val="24"/>
+        </w:rPr>
+        <w:t>:</w:t>
+      </w:r>
+    </w:p>
+    <w:p>
+      <w:pPr>
+        <w:spacing w:after="0"/>
+        <w:rPr>
+          <w:rFonts w:asciiTheme="majorBidi" w:hAnsiTheme="majorBidi" w:cstheme="majorBidi"/>
+          <w:sz w:val="24"/>
+          <w:szCs w:val="24"/>
+        </w:rPr>
+      </w:pPr>
+      <w:r>
+        <w:rPr>
+          <w:rFonts w:asciiTheme="majorBidi" w:hAnsiTheme="majorBidi" w:cstheme="majorBidi"/>
+          <w:sz w:val="24"/>
+          <w:szCs w:val="24"/>
+        </w:rPr>
+        <w:t>The findings from the assessment and capability determination then lead to the development of an improvement strategy, which suggests methods and actions to improve the existing process. This strategy identifies necessary changes to the software process</w:t>
+      </w:r>
+      <w:r>
+        <w:rPr>
+          <w:rFonts w:asciiTheme="majorBidi" w:hAnsiTheme="majorBidi" w:cstheme="majorBidi"/>
+          <w:sz w:val="24"/>
+          <w:szCs w:val="24"/>
+        </w:rPr>
+        <w:t>.</w:t>
+      </w:r>
+    </w:p>
+    <w:p>
+      <w:pPr>
+        <w:pStyle w:val="NormalWeb"/>
+        <w:spacing w:before="0" w:beforeAutospacing="0" w:after="0" w:afterAutospacing="0"/>
+        <w:rPr>
+          <w:rFonts w:asciiTheme="majorBidi" w:hAnsiTheme="majorBidi" w:cstheme="majorBidi"/>
+        </w:rPr>
+      </w:pPr>
+      <w:r>
+        <w:rPr>
+          <w:rFonts w:asciiTheme="majorBidi" w:hAnsiTheme="majorBidi" w:cstheme="majorBidi"/>
+          <w:b/>
+          <w:bCs/>
+        </w:rPr>
+        <w:t>Software Process (Implementation):</w:t>
+      </w:r>
+    </w:p>
+    <w:p>
+      <w:pPr>
+        <w:pStyle w:val="NormalWeb"/>
+        <w:numPr>
+          <w:ilvl w:val="0"/>
+          <w:numId w:val="20"/>
+        </w:numPr>
+        <w:rPr>
+          <w:rFonts w:asciiTheme="majorBidi" w:hAnsiTheme="majorBidi" w:cstheme="majorBidi"/>
+        </w:rPr>
+      </w:pPr>
+      <w:r>
+        <w:rPr>
+          <w:rStyle w:val="citation-44"/>
+          <w:rFonts w:asciiTheme="majorBidi" w:hAnsiTheme="majorBidi" w:cstheme="majorBidi"/>
+        </w:rPr>
+        <w:t>This is where the actual changes are made to the daily work routines</w:t>
+      </w:r>
+      <w:r>
+        <w:rPr>
+          <w:rFonts w:asciiTheme="majorBidi" w:hAnsiTheme="majorBidi" w:cstheme="majorBidi"/>
+        </w:rPr>
+        <w:t>.</w:t>
+      </w:r>
+    </w:p>
+    <w:p>
+      <w:pPr>
+        <w:pStyle w:val="NormalWeb"/>
+        <w:numPr>
+          <w:ilvl w:val="0"/>
+          <w:numId w:val="20"/>
+        </w:numPr>
+        <w:rPr>
+          <w:rStyle w:val="citation-43"/>
+          <w:rFonts w:asciiTheme="majorBidi" w:hAnsiTheme="majorBidi" w:cstheme="majorBidi"/>
+        </w:rPr>
+      </w:pPr>
+      <w:r>
+        <w:rPr>
+          <w:rStyle w:val="citation-43"/>
+          <w:rFonts w:asciiTheme="majorBidi" w:hAnsiTheme="majorBidi" w:cstheme="majorBidi"/>
+        </w:rPr>
+        <w:t>The goal is to improve efficiency and the quality of the software</w:t>
+      </w:r>
+    </w:p>
+    <w:p>
+      <w:pPr>
+        <w:pStyle w:val="NormalWeb"/>
+        <w:numPr>
+          <w:ilvl w:val="0"/>
+          <w:numId w:val="20"/>
+        </w:numPr>
+        <w:rPr>
+          <w:rFonts w:asciiTheme="majorBidi" w:hAnsiTheme="majorBidi" w:cstheme="majorBidi"/>
+        </w:rPr>
+      </w:pPr>
+      <w:r>
+        <w:rPr>
+          <w:rFonts w:asciiTheme="majorBidi" w:hAnsiTheme="majorBidi" w:cstheme="majorBidi"/>
+        </w:rPr>
+        <w:t>The improved process is then reassessed, creating a continuous cycle of evaluation and improvement.</w:t>
+      </w:r>
+    </w:p>
+    <w:p>
+      <w:pPr>
+        <w:spacing w:after="0"/>
+        <w:rPr>
+          <w:rFonts w:asciiTheme="majorBidi" w:hAnsiTheme="majorBidi" w:cstheme="majorBidi"/>
+          <w:b/>
+          <w:bCs/>
+          <w:sz w:val="24"/>
+          <w:szCs w:val="24"/>
+        </w:rPr>
+      </w:pPr>
+      <w:r>
+        <w:rPr>
+          <w:rFonts w:asciiTheme="majorBidi" w:hAnsiTheme="majorBidi" w:cstheme="majorBidi"/>
+          <w:b/>
+          <w:bCs/>
+          <w:sz w:val="24"/>
+          <w:szCs w:val="24"/>
+        </w:rPr>
+        <w:br/>
+      </w:r>
+    </w:p>
+    <w:p>
+      <w:pPr>
+        <w:rPr>
+          <w:rFonts w:asciiTheme="majorBidi" w:hAnsiTheme="majorBidi" w:cstheme="majorBidi"/>
+          <w:b/>
+          <w:bCs/>
+          <w:sz w:val="24"/>
+          <w:szCs w:val="24"/>
+        </w:rPr>
+      </w:pPr>
+      <w:r>
+        <w:rPr>
+          <w:rFonts w:asciiTheme="majorBidi" w:hAnsiTheme="majorBidi" w:cstheme="majorBidi"/>
+          <w:b/>
+          <w:bCs/>
+          <w:sz w:val="24"/>
+          <w:szCs w:val="24"/>
+        </w:rPr>
+        <w:br w:type="page"/>
+      </w:r>
+    </w:p>
+    <w:p/>
+    <w:p>
+      <w:pPr>
+        <w:pStyle w:val="Heading2"/>
+        <w:rPr>
+          <w:b/>
+          <w:bCs/>
+          <w:color w:val="auto"/>
+        </w:rPr>
+      </w:pPr>
+      <w:r>
+        <w:rPr>
+          <w:rFonts w:ascii="Segoe UI Emoji" w:hAnsi="Segoe UI Emoji" w:cs="Segoe UI Emoji"/>
+          <w:b/>
+          <w:bCs/>
+          <w:color w:val="auto"/>
+        </w:rPr>
+        <w:t>🔹</w:t>
+      </w:r>
+      <w:r>
+        <w:rPr>
+          <w:b/>
+          <w:bCs/>
+          <w:color w:val="auto"/>
+        </w:rPr>
+        <w:t xml:space="preserve"> Swim Lane Diagram (Process Mapping)</w:t>
+      </w:r>
+    </w:p>
+    <w:p>
+      <w:pPr>
+        <w:pStyle w:val="NormalWeb"/>
+        <w:numPr>
+          <w:ilvl w:val="0"/>
+          <w:numId w:val="21"/>
+        </w:numPr>
+      </w:pPr>
+      <w:r>
+        <w:t xml:space="preserve">It is a </w:t>
+      </w:r>
+      <w:r>
+        <w:rPr>
+          <w:rStyle w:val="Strong"/>
+        </w:rPr>
+        <w:t>type of flowchart</w:t>
+      </w:r>
+      <w:r>
+        <w:t xml:space="preserve"> that shows a process step-by-step.</w:t>
+      </w:r>
+    </w:p>
+    <w:p>
+      <w:pPr>
+        <w:pStyle w:val="NormalWeb"/>
+        <w:numPr>
+          <w:ilvl w:val="0"/>
+          <w:numId w:val="21"/>
+        </w:numPr>
+      </w:pPr>
+      <w:r>
+        <w:t xml:space="preserve">The process is divided into </w:t>
+      </w:r>
+      <w:r>
+        <w:rPr>
+          <w:rStyle w:val="Strong"/>
+        </w:rPr>
+        <w:t>lanes (like a swimming pool)</w:t>
+      </w:r>
+      <w:r>
+        <w:t>.</w:t>
+      </w:r>
+    </w:p>
+    <w:p>
+      <w:pPr>
+        <w:pStyle w:val="NormalWeb"/>
+        <w:numPr>
+          <w:ilvl w:val="0"/>
+          <w:numId w:val="21"/>
+        </w:numPr>
+      </w:pPr>
+      <w:r>
+        <w:t xml:space="preserve">It shows </w:t>
+      </w:r>
+      <w:r>
+        <w:rPr>
+          <w:rStyle w:val="Strong"/>
+        </w:rPr>
+        <w:t>who is doing what</w:t>
+      </w:r>
+      <w:r>
+        <w:t xml:space="preserve"> in a process.</w:t>
+      </w:r>
+    </w:p>
+    <w:p>
+      <w:pPr>
+        <w:pStyle w:val="NormalWeb"/>
+        <w:numPr>
+          <w:ilvl w:val="0"/>
+          <w:numId w:val="21"/>
+        </w:numPr>
+      </w:pPr>
+      <w:r>
+        <w:t xml:space="preserve">Helps make responsibilities </w:t>
+      </w:r>
+      <w:r>
+        <w:rPr>
+          <w:rStyle w:val="Strong"/>
+        </w:rPr>
+        <w:t>clear and organized</w:t>
+      </w:r>
+      <w:r>
+        <w:t>.</w:t>
+      </w:r>
+    </w:p>
+    <w:p>
+      <w:pPr>
+        <w:pStyle w:val="NormalWeb"/>
+      </w:pPr>
+      <w:r>
+        <w:rPr>
+          <w:rFonts w:ascii="Segoe UI Emoji" w:hAnsi="Segoe UI Emoji" w:cs="Segoe UI Emoji"/>
+        </w:rPr>
+        <w:t>👉</w:t>
+      </w:r>
+      <w:r>
+        <w:t xml:space="preserve"> Each lane represents:</w:t>
+      </w:r>
+    </w:p>
+    <w:p>
+      <w:pPr>
+        <w:pStyle w:val="NormalWeb"/>
+        <w:numPr>
+          <w:ilvl w:val="0"/>
+          <w:numId w:val="22"/>
+        </w:numPr>
+      </w:pPr>
+      <w:r>
+        <w:t xml:space="preserve">A </w:t>
+      </w:r>
+      <w:r>
+        <w:rPr>
+          <w:rStyle w:val="Strong"/>
+        </w:rPr>
+        <w:t>person</w:t>
+      </w:r>
+    </w:p>
+    <w:p>
+      <w:pPr>
+        <w:pStyle w:val="NormalWeb"/>
+        <w:numPr>
+          <w:ilvl w:val="0"/>
+          <w:numId w:val="22"/>
+        </w:numPr>
+      </w:pPr>
+      <w:r>
+        <w:t xml:space="preserve">A </w:t>
+      </w:r>
+      <w:r>
+        <w:rPr>
+          <w:rStyle w:val="Strong"/>
+        </w:rPr>
+        <w:t>team</w:t>
+      </w:r>
+    </w:p>
+    <w:p>
+      <w:pPr>
+        <w:pStyle w:val="NormalWeb"/>
+        <w:numPr>
+          <w:ilvl w:val="0"/>
+          <w:numId w:val="22"/>
+        </w:numPr>
+      </w:pPr>
+      <w:r>
+        <w:t xml:space="preserve">A </w:t>
+      </w:r>
+      <w:r>
+        <w:rPr>
+          <w:rStyle w:val="Strong"/>
+        </w:rPr>
+        <w:t>department</w:t>
+      </w:r>
+    </w:p>
+    <w:p>
+      <w:pPr>
+        <w:pStyle w:val="NormalWeb"/>
+      </w:pPr>
+      <w:r>
+        <w:rPr>
+          <w:rFonts w:ascii="Segoe UI Emoji" w:hAnsi="Segoe UI Emoji" w:cs="Segoe UI Emoji"/>
+        </w:rPr>
+        <w:t>🔹</w:t>
+      </w:r>
+      <w:r>
+        <w:t xml:space="preserve"> Why it is used</w:t>
+      </w:r>
+    </w:p>
+    <w:p>
+      <w:pPr>
+        <w:pStyle w:val="NormalWeb"/>
+        <w:numPr>
+          <w:ilvl w:val="0"/>
+          <w:numId w:val="24"/>
+        </w:numPr>
+      </w:pPr>
+      <w:r>
+        <w:t xml:space="preserve">To </w:t>
+      </w:r>
+      <w:r>
+        <w:rPr>
+          <w:rStyle w:val="Strong"/>
+        </w:rPr>
+        <w:t>understand workflows easily</w:t>
+      </w:r>
+    </w:p>
+    <w:p>
+      <w:pPr>
+        <w:pStyle w:val="NormalWeb"/>
+        <w:numPr>
+          <w:ilvl w:val="0"/>
+          <w:numId w:val="24"/>
+        </w:numPr>
+      </w:pPr>
+      <w:r>
+        <w:t>To find:</w:t>
+      </w:r>
+    </w:p>
+    <w:p>
+      <w:pPr>
+        <w:pStyle w:val="NormalWeb"/>
+        <w:numPr>
+          <w:ilvl w:val="1"/>
+          <w:numId w:val="24"/>
+        </w:numPr>
+      </w:pPr>
+      <w:r>
+        <w:t xml:space="preserve">Delays </w:t>
+      </w:r>
+      <w:r>
+        <w:rPr>
+          <w:rFonts w:ascii="Segoe UI Emoji" w:hAnsi="Segoe UI Emoji" w:cs="Segoe UI Emoji"/>
+        </w:rPr>
+        <w:t>⏳</w:t>
+      </w:r>
+    </w:p>
+    <w:p>
+      <w:pPr>
+        <w:pStyle w:val="NormalWeb"/>
+        <w:numPr>
+          <w:ilvl w:val="1"/>
+          <w:numId w:val="24"/>
+        </w:numPr>
+      </w:pPr>
+      <w:r>
+        <w:t xml:space="preserve">Confusion </w:t>
+      </w:r>
+      <w:r>
+        <w:rPr>
+          <w:rFonts w:ascii="Segoe UI Emoji" w:hAnsi="Segoe UI Emoji" w:cs="Segoe UI Emoji"/>
+        </w:rPr>
+        <w:t>❌</w:t>
+      </w:r>
+    </w:p>
+    <w:p>
+      <w:pPr>
+        <w:pStyle w:val="NormalWeb"/>
+        <w:numPr>
+          <w:ilvl w:val="1"/>
+          <w:numId w:val="24"/>
+        </w:numPr>
+      </w:pPr>
+      <w:r>
+        <w:t>Missing steps</w:t>
+      </w:r>
+    </w:p>
+    <w:p>
+      <w:pPr>
+        <w:pStyle w:val="NormalWeb"/>
+      </w:pPr>
+      <w:r>
+        <w:t xml:space="preserve">A swim lane diagram is a </w:t>
+      </w:r>
+      <w:r>
+        <w:rPr>
+          <w:rStyle w:val="Strong"/>
+        </w:rPr>
+        <w:t>process map that shows steps and responsibilities in separate lanes</w:t>
+      </w:r>
+      <w:r>
+        <w:t>.</w:t>
+      </w:r>
+    </w:p>
+    <w:p>
+      <w:pPr>
+        <w:spacing w:after="0"/>
         <w:rPr>
           <w:rFonts w:asciiTheme="majorBidi" w:hAnsiTheme="majorBidi" w:cstheme="majorBidi"/>
           <w:b/>
@@ -4573,6 +5513,155 @@
 <file path=word/numbering.xml><?xml version="1.0" encoding="utf-8"?>
 <w:numbering xmlns:wpc="http://schemas.microsoft.com/office/word/2010/wordprocessingCanvas" xmlns:cx="http://schemas.microsoft.com/office/drawing/2014/chartex" xmlns:cx1="http://schemas.microsoft.com/office/drawing/2015/9/8/chartex" xmlns:cx2="http://schemas.microsoft.com/office/drawing/2015/10/21/chartex" xmlns:cx3="http://schemas.microsoft.com/office/drawing/2016/5/9/chartex" xmlns:cx4="http://schemas.microsoft.com/office/drawing/2016/5/10/chartex" xmlns:cx5="http://schemas.microsoft.com/office/drawing/2016/5/11/chartex" xmlns:cx6="http://schemas.microsoft.com/office/drawing/2016/5/12/chartex" xmlns:cx7="http://schemas.microsoft.com/office/drawing/2016/5/13/chartex" xmlns:cx8="http://schemas.microsoft.com/office/drawing/2016/5/14/chartex" xmlns:mc="http://schemas.openxmlformats.org/markup-compatibility/2006" xmlns:aink="http://schemas.microsoft.com/office/drawing/2016/ink" xmlns:am3d="http://schemas.microsoft.com/office/drawing/2017/model3d" xmlns:o="urn:schemas-microsoft-com:office:office" xmlns:r="http://schemas.openxmlformats.org/officeDocument/2006/relationships" xmlns:m="http://schemas.openxmlformats.org/officeDocument/2006/math" xmlns:v="urn:schemas-microsoft-com:vml" xmlns:wp14="http://schemas.microsoft.com/office/word/2010/wordprocessingDrawing" xmlns:wp="http://schemas.openxmlformats.org/drawingml/2006/wordprocessingDrawing" xmlns:w10="urn:schemas-microsoft-com:office:word" xmlns:w="http://schemas.openxmlformats.org/wordprocessingml/2006/main" xmlns:w14="http://schemas.microsoft.com/office/word/2010/wordml" xmlns:w15="http://schemas.microsoft.com/office/word/2012/wordml" xmlns:w16cex="http://schemas.microsoft.com/office/word/2018/wordml/cex" xmlns:w16cid="http://schemas.microsoft.com/office/word/2016/wordml/cid" xmlns:w16="http://schemas.microsoft.com/office/word/2018/wordml" xmlns:w16sdtdh="http://schemas.microsoft.com/office/word/2020/wordml/sdtdatahash" xmlns:w16se="http://schemas.microsoft.com/office/word/2015/wordml/symex" xmlns:wpg="http://schemas.microsoft.com/office/word/2010/wordprocessingGroup" xmlns:wpi="http://schemas.microsoft.com/office/word/2010/wordprocessingInk" xmlns:wne="http://schemas.microsoft.com/office/word/2006/wordml" xmlns:wps="http://schemas.microsoft.com/office/word/2010/wordprocessingShape" mc:Ignorable="w14 w15 w16se w16cid w16 w16cex w16sdtdh wp14">
   <w:abstractNum w:abstractNumId="0" w15:restartNumberingAfterBreak="0">
+    <w:nsid w:val="0FB13755"/>
+    <w:multiLevelType w:val="multilevel"/>
+    <w:tmpl w:val="F772825C"/>
+    <w:lvl w:ilvl="0">
+      <w:start w:val="1"/>
+      <w:numFmt w:val="bullet"/>
+      <w:lvlText w:val=""/>
+      <w:lvlJc w:val="left"/>
+      <w:pPr>
+        <w:tabs>
+          <w:tab w:val="num" w:pos="720"/>
+        </w:tabs>
+        <w:ind w:left="720" w:hanging="360"/>
+      </w:pPr>
+      <w:rPr>
+        <w:rFonts w:ascii="Symbol" w:hAnsi="Symbol" w:hint="default"/>
+        <w:sz w:val="20"/>
+      </w:rPr>
+    </w:lvl>
+    <w:lvl w:ilvl="1" w:tentative="1">
+      <w:start w:val="1"/>
+      <w:numFmt w:val="bullet"/>
+      <w:lvlText w:val="o"/>
+      <w:lvlJc w:val="left"/>
+      <w:pPr>
+        <w:tabs>
+          <w:tab w:val="num" w:pos="1440"/>
+        </w:tabs>
+        <w:ind w:left="1440" w:hanging="360"/>
+      </w:pPr>
+      <w:rPr>
+        <w:rFonts w:ascii="Courier New" w:hAnsi="Courier New" w:hint="default"/>
+        <w:sz w:val="20"/>
+      </w:rPr>
+    </w:lvl>
+    <w:lvl w:ilvl="2" w:tentative="1">
+      <w:start w:val="1"/>
+      <w:numFmt w:val="bullet"/>
+      <w:lvlText w:val=""/>
+      <w:lvlJc w:val="left"/>
+      <w:pPr>
+        <w:tabs>
+          <w:tab w:val="num" w:pos="2160"/>
+        </w:tabs>
+        <w:ind w:left="2160" w:hanging="360"/>
+      </w:pPr>
+      <w:rPr>
+        <w:rFonts w:ascii="Wingdings" w:hAnsi="Wingdings" w:hint="default"/>
+        <w:sz w:val="20"/>
+      </w:rPr>
+    </w:lvl>
+    <w:lvl w:ilvl="3" w:tentative="1">
+      <w:start w:val="1"/>
+      <w:numFmt w:val="bullet"/>
+      <w:lvlText w:val=""/>
+      <w:lvlJc w:val="left"/>
+      <w:pPr>
+        <w:tabs>
+          <w:tab w:val="num" w:pos="2880"/>
+        </w:tabs>
+        <w:ind w:left="2880" w:hanging="360"/>
+      </w:pPr>
+      <w:rPr>
+        <w:rFonts w:ascii="Wingdings" w:hAnsi="Wingdings" w:hint="default"/>
+        <w:sz w:val="20"/>
+      </w:rPr>
+    </w:lvl>
+    <w:lvl w:ilvl="4" w:tentative="1">
+      <w:start w:val="1"/>
+      <w:numFmt w:val="bullet"/>
+      <w:lvlText w:val=""/>
+      <w:lvlJc w:val="left"/>
+      <w:pPr>
+        <w:tabs>
+          <w:tab w:val="num" w:pos="3600"/>
+        </w:tabs>
+        <w:ind w:left="3600" w:hanging="360"/>
+      </w:pPr>
+      <w:rPr>
+        <w:rFonts w:ascii="Wingdings" w:hAnsi="Wingdings" w:hint="default"/>
+        <w:sz w:val="20"/>
+      </w:rPr>
+    </w:lvl>
+    <w:lvl w:ilvl="5" w:tentative="1">
+      <w:start w:val="1"/>
+      <w:numFmt w:val="bullet"/>
+      <w:lvlText w:val=""/>
+      <w:lvlJc w:val="left"/>
+      <w:pPr>
+        <w:tabs>
+          <w:tab w:val="num" w:pos="4320"/>
+        </w:tabs>
+        <w:ind w:left="4320" w:hanging="360"/>
+      </w:pPr>
+      <w:rPr>
+        <w:rFonts w:ascii="Wingdings" w:hAnsi="Wingdings" w:hint="default"/>
+        <w:sz w:val="20"/>
+      </w:rPr>
+    </w:lvl>
+    <w:lvl w:ilvl="6" w:tentative="1">
+      <w:start w:val="1"/>
+      <w:numFmt w:val="bullet"/>
+      <w:lvlText w:val=""/>
+      <w:lvlJc w:val="left"/>
+      <w:pPr>
+        <w:tabs>
+          <w:tab w:val="num" w:pos="5040"/>
+        </w:tabs>
+        <w:ind w:left="5040" w:hanging="360"/>
+      </w:pPr>
+      <w:rPr>
+        <w:rFonts w:ascii="Wingdings" w:hAnsi="Wingdings" w:hint="default"/>
+        <w:sz w:val="20"/>
+      </w:rPr>
+    </w:lvl>
+    <w:lvl w:ilvl="7" w:tentative="1">
+      <w:start w:val="1"/>
+      <w:numFmt w:val="bullet"/>
+      <w:lvlText w:val=""/>
+      <w:lvlJc w:val="left"/>
+      <w:pPr>
+        <w:tabs>
+          <w:tab w:val="num" w:pos="5760"/>
+        </w:tabs>
+        <w:ind w:left="5760" w:hanging="360"/>
+      </w:pPr>
+      <w:rPr>
+        <w:rFonts w:ascii="Wingdings" w:hAnsi="Wingdings" w:hint="default"/>
+        <w:sz w:val="20"/>
+      </w:rPr>
+    </w:lvl>
+    <w:lvl w:ilvl="8" w:tentative="1">
+      <w:start w:val="1"/>
+      <w:numFmt w:val="bullet"/>
+      <w:lvlText w:val=""/>
+      <w:lvlJc w:val="left"/>
+      <w:pPr>
+        <w:tabs>
+          <w:tab w:val="num" w:pos="6480"/>
+        </w:tabs>
+        <w:ind w:left="6480" w:hanging="360"/>
+      </w:pPr>
+      <w:rPr>
+        <w:rFonts w:ascii="Wingdings" w:hAnsi="Wingdings" w:hint="default"/>
+        <w:sz w:val="20"/>
+      </w:rPr>
+    </w:lvl>
+  </w:abstractNum>
+  <w:abstractNum w:abstractNumId="1" w15:restartNumberingAfterBreak="0">
     <w:nsid w:val="14791FA6"/>
     <w:multiLevelType w:val="multilevel"/>
     <w:tmpl w:val="A3405D9E"/>
@@ -4721,7 +5810,7 @@
       </w:rPr>
     </w:lvl>
   </w:abstractNum>
-  <w:abstractNum w:abstractNumId="1" w15:restartNumberingAfterBreak="0">
+  <w:abstractNum w:abstractNumId="2" w15:restartNumberingAfterBreak="0">
     <w:nsid w:val="18536C45"/>
     <w:multiLevelType w:val="multilevel"/>
     <w:tmpl w:val="A8F2C504"/>
@@ -4870,7 +5959,7 @@
       </w:rPr>
     </w:lvl>
   </w:abstractNum>
-  <w:abstractNum w:abstractNumId="2" w15:restartNumberingAfterBreak="0">
+  <w:abstractNum w:abstractNumId="3" w15:restartNumberingAfterBreak="0">
     <w:nsid w:val="1F10615E"/>
     <w:multiLevelType w:val="multilevel"/>
     <w:tmpl w:val="0EA4E8DC"/>
@@ -5019,7 +6108,156 @@
       </w:rPr>
     </w:lvl>
   </w:abstractNum>
-  <w:abstractNum w:abstractNumId="3" w15:restartNumberingAfterBreak="0">
+  <w:abstractNum w:abstractNumId="4" w15:restartNumberingAfterBreak="0">
+    <w:nsid w:val="209827EE"/>
+    <w:multiLevelType w:val="multilevel"/>
+    <w:tmpl w:val="FA7E6DC0"/>
+    <w:lvl w:ilvl="0">
+      <w:start w:val="1"/>
+      <w:numFmt w:val="bullet"/>
+      <w:lvlText w:val=""/>
+      <w:lvlJc w:val="left"/>
+      <w:pPr>
+        <w:tabs>
+          <w:tab w:val="num" w:pos="720"/>
+        </w:tabs>
+        <w:ind w:left="720" w:hanging="360"/>
+      </w:pPr>
+      <w:rPr>
+        <w:rFonts w:ascii="Symbol" w:hAnsi="Symbol" w:hint="default"/>
+        <w:sz w:val="20"/>
+      </w:rPr>
+    </w:lvl>
+    <w:lvl w:ilvl="1" w:tentative="1">
+      <w:start w:val="1"/>
+      <w:numFmt w:val="bullet"/>
+      <w:lvlText w:val="o"/>
+      <w:lvlJc w:val="left"/>
+      <w:pPr>
+        <w:tabs>
+          <w:tab w:val="num" w:pos="1440"/>
+        </w:tabs>
+        <w:ind w:left="1440" w:hanging="360"/>
+      </w:pPr>
+      <w:rPr>
+        <w:rFonts w:ascii="Courier New" w:hAnsi="Courier New" w:hint="default"/>
+        <w:sz w:val="20"/>
+      </w:rPr>
+    </w:lvl>
+    <w:lvl w:ilvl="2" w:tentative="1">
+      <w:start w:val="1"/>
+      <w:numFmt w:val="bullet"/>
+      <w:lvlText w:val=""/>
+      <w:lvlJc w:val="left"/>
+      <w:pPr>
+        <w:tabs>
+          <w:tab w:val="num" w:pos="2160"/>
+        </w:tabs>
+        <w:ind w:left="2160" w:hanging="360"/>
+      </w:pPr>
+      <w:rPr>
+        <w:rFonts w:ascii="Wingdings" w:hAnsi="Wingdings" w:hint="default"/>
+        <w:sz w:val="20"/>
+      </w:rPr>
+    </w:lvl>
+    <w:lvl w:ilvl="3" w:tentative="1">
+      <w:start w:val="1"/>
+      <w:numFmt w:val="bullet"/>
+      <w:lvlText w:val=""/>
+      <w:lvlJc w:val="left"/>
+      <w:pPr>
+        <w:tabs>
+          <w:tab w:val="num" w:pos="2880"/>
+        </w:tabs>
+        <w:ind w:left="2880" w:hanging="360"/>
+      </w:pPr>
+      <w:rPr>
+        <w:rFonts w:ascii="Wingdings" w:hAnsi="Wingdings" w:hint="default"/>
+        <w:sz w:val="20"/>
+      </w:rPr>
+    </w:lvl>
+    <w:lvl w:ilvl="4" w:tentative="1">
+      <w:start w:val="1"/>
+      <w:numFmt w:val="bullet"/>
+      <w:lvlText w:val=""/>
+      <w:lvlJc w:val="left"/>
+      <w:pPr>
+        <w:tabs>
+          <w:tab w:val="num" w:pos="3600"/>
+        </w:tabs>
+        <w:ind w:left="3600" w:hanging="360"/>
+      </w:pPr>
+      <w:rPr>
+        <w:rFonts w:ascii="Wingdings" w:hAnsi="Wingdings" w:hint="default"/>
+        <w:sz w:val="20"/>
+      </w:rPr>
+    </w:lvl>
+    <w:lvl w:ilvl="5" w:tentative="1">
+      <w:start w:val="1"/>
+      <w:numFmt w:val="bullet"/>
+      <w:lvlText w:val=""/>
+      <w:lvlJc w:val="left"/>
+      <w:pPr>
+        <w:tabs>
+          <w:tab w:val="num" w:pos="4320"/>
+        </w:tabs>
+        <w:ind w:left="4320" w:hanging="360"/>
+      </w:pPr>
+      <w:rPr>
+        <w:rFonts w:ascii="Wingdings" w:hAnsi="Wingdings" w:hint="default"/>
+        <w:sz w:val="20"/>
+      </w:rPr>
+    </w:lvl>
+    <w:lvl w:ilvl="6" w:tentative="1">
+      <w:start w:val="1"/>
+      <w:numFmt w:val="bullet"/>
+      <w:lvlText w:val=""/>
+      <w:lvlJc w:val="left"/>
+      <w:pPr>
+        <w:tabs>
+          <w:tab w:val="num" w:pos="5040"/>
+        </w:tabs>
+        <w:ind w:left="5040" w:hanging="360"/>
+      </w:pPr>
+      <w:rPr>
+        <w:rFonts w:ascii="Wingdings" w:hAnsi="Wingdings" w:hint="default"/>
+        <w:sz w:val="20"/>
+      </w:rPr>
+    </w:lvl>
+    <w:lvl w:ilvl="7" w:tentative="1">
+      <w:start w:val="1"/>
+      <w:numFmt w:val="bullet"/>
+      <w:lvlText w:val=""/>
+      <w:lvlJc w:val="left"/>
+      <w:pPr>
+        <w:tabs>
+          <w:tab w:val="num" w:pos="5760"/>
+        </w:tabs>
+        <w:ind w:left="5760" w:hanging="360"/>
+      </w:pPr>
+      <w:rPr>
+        <w:rFonts w:ascii="Wingdings" w:hAnsi="Wingdings" w:hint="default"/>
+        <w:sz w:val="20"/>
+      </w:rPr>
+    </w:lvl>
+    <w:lvl w:ilvl="8" w:tentative="1">
+      <w:start w:val="1"/>
+      <w:numFmt w:val="bullet"/>
+      <w:lvlText w:val=""/>
+      <w:lvlJc w:val="left"/>
+      <w:pPr>
+        <w:tabs>
+          <w:tab w:val="num" w:pos="6480"/>
+        </w:tabs>
+        <w:ind w:left="6480" w:hanging="360"/>
+      </w:pPr>
+      <w:rPr>
+        <w:rFonts w:ascii="Wingdings" w:hAnsi="Wingdings" w:hint="default"/>
+        <w:sz w:val="20"/>
+      </w:rPr>
+    </w:lvl>
+  </w:abstractNum>
+  <w:abstractNum w:abstractNumId="5" w15:restartNumberingAfterBreak="0">
     <w:nsid w:val="24910FB6"/>
     <w:multiLevelType w:val="multilevel"/>
     <w:tmpl w:val="CC8CAA88"/>
@@ -5168,7 +6406,305 @@
       </w:rPr>
     </w:lvl>
   </w:abstractNum>
-  <w:abstractNum w:abstractNumId="4" w15:restartNumberingAfterBreak="0">
+  <w:abstractNum w:abstractNumId="6" w15:restartNumberingAfterBreak="0">
+    <w:nsid w:val="2E122DA0"/>
+    <w:multiLevelType w:val="multilevel"/>
+    <w:tmpl w:val="078A9BC8"/>
+    <w:lvl w:ilvl="0">
+      <w:start w:val="1"/>
+      <w:numFmt w:val="bullet"/>
+      <w:lvlText w:val=""/>
+      <w:lvlJc w:val="left"/>
+      <w:pPr>
+        <w:tabs>
+          <w:tab w:val="num" w:pos="720"/>
+        </w:tabs>
+        <w:ind w:left="720" w:hanging="360"/>
+      </w:pPr>
+      <w:rPr>
+        <w:rFonts w:ascii="Symbol" w:hAnsi="Symbol" w:hint="default"/>
+        <w:sz w:val="20"/>
+      </w:rPr>
+    </w:lvl>
+    <w:lvl w:ilvl="1" w:tentative="1">
+      <w:start w:val="1"/>
+      <w:numFmt w:val="bullet"/>
+      <w:lvlText w:val="o"/>
+      <w:lvlJc w:val="left"/>
+      <w:pPr>
+        <w:tabs>
+          <w:tab w:val="num" w:pos="1440"/>
+        </w:tabs>
+        <w:ind w:left="1440" w:hanging="360"/>
+      </w:pPr>
+      <w:rPr>
+        <w:rFonts w:ascii="Courier New" w:hAnsi="Courier New" w:hint="default"/>
+        <w:sz w:val="20"/>
+      </w:rPr>
+    </w:lvl>
+    <w:lvl w:ilvl="2" w:tentative="1">
+      <w:start w:val="1"/>
+      <w:numFmt w:val="bullet"/>
+      <w:lvlText w:val=""/>
+      <w:lvlJc w:val="left"/>
+      <w:pPr>
+        <w:tabs>
+          <w:tab w:val="num" w:pos="2160"/>
+        </w:tabs>
+        <w:ind w:left="2160" w:hanging="360"/>
+      </w:pPr>
+      <w:rPr>
+        <w:rFonts w:ascii="Wingdings" w:hAnsi="Wingdings" w:hint="default"/>
+        <w:sz w:val="20"/>
+      </w:rPr>
+    </w:lvl>
+    <w:lvl w:ilvl="3" w:tentative="1">
+      <w:start w:val="1"/>
+      <w:numFmt w:val="bullet"/>
+      <w:lvlText w:val=""/>
+      <w:lvlJc w:val="left"/>
+      <w:pPr>
+        <w:tabs>
+          <w:tab w:val="num" w:pos="2880"/>
+        </w:tabs>
+        <w:ind w:left="2880" w:hanging="360"/>
+      </w:pPr>
+      <w:rPr>
+        <w:rFonts w:ascii="Wingdings" w:hAnsi="Wingdings" w:hint="default"/>
+        <w:sz w:val="20"/>
+      </w:rPr>
+    </w:lvl>
+    <w:lvl w:ilvl="4" w:tentative="1">
+      <w:start w:val="1"/>
+      <w:numFmt w:val="bullet"/>
+      <w:lvlText w:val=""/>
+      <w:lvlJc w:val="left"/>
+      <w:pPr>
+        <w:tabs>
+          <w:tab w:val="num" w:pos="3600"/>
+        </w:tabs>
+        <w:ind w:left="3600" w:hanging="360"/>
+      </w:pPr>
+      <w:rPr>
+        <w:rFonts w:ascii="Wingdings" w:hAnsi="Wingdings" w:hint="default"/>
+        <w:sz w:val="20"/>
+      </w:rPr>
+    </w:lvl>
+    <w:lvl w:ilvl="5" w:tentative="1">
+      <w:start w:val="1"/>
+      <w:numFmt w:val="bullet"/>
+      <w:lvlText w:val=""/>
+      <w:lvlJc w:val="left"/>
+      <w:pPr>
+        <w:tabs>
+          <w:tab w:val="num" w:pos="4320"/>
+        </w:tabs>
+        <w:ind w:left="4320" w:hanging="360"/>
+      </w:pPr>
+      <w:rPr>
+        <w:rFonts w:ascii="Wingdings" w:hAnsi="Wingdings" w:hint="default"/>
+        <w:sz w:val="20"/>
+      </w:rPr>
+    </w:lvl>
+    <w:lvl w:ilvl="6" w:tentative="1">
+      <w:start w:val="1"/>
+      <w:numFmt w:val="bullet"/>
+      <w:lvlText w:val=""/>
+      <w:lvlJc w:val="left"/>
+      <w:pPr>
+        <w:tabs>
+          <w:tab w:val="num" w:pos="5040"/>
+        </w:tabs>
+        <w:ind w:left="5040" w:hanging="360"/>
+      </w:pPr>
+      <w:rPr>
+        <w:rFonts w:ascii="Wingdings" w:hAnsi="Wingdings" w:hint="default"/>
+        <w:sz w:val="20"/>
+      </w:rPr>
+    </w:lvl>
+    <w:lvl w:ilvl="7" w:tentative="1">
+      <w:start w:val="1"/>
+      <w:numFmt w:val="bullet"/>
+      <w:lvlText w:val=""/>
+      <w:lvlJc w:val="left"/>
+      <w:pPr>
+        <w:tabs>
+          <w:tab w:val="num" w:pos="5760"/>
+        </w:tabs>
+        <w:ind w:left="5760" w:hanging="360"/>
+      </w:pPr>
+      <w:rPr>
+        <w:rFonts w:ascii="Wingdings" w:hAnsi="Wingdings" w:hint="default"/>
+        <w:sz w:val="20"/>
+      </w:rPr>
+    </w:lvl>
+    <w:lvl w:ilvl="8" w:tentative="1">
+      <w:start w:val="1"/>
+      <w:numFmt w:val="bullet"/>
+      <w:lvlText w:val=""/>
+      <w:lvlJc w:val="left"/>
+      <w:pPr>
+        <w:tabs>
+          <w:tab w:val="num" w:pos="6480"/>
+        </w:tabs>
+        <w:ind w:left="6480" w:hanging="360"/>
+      </w:pPr>
+      <w:rPr>
+        <w:rFonts w:ascii="Wingdings" w:hAnsi="Wingdings" w:hint="default"/>
+        <w:sz w:val="20"/>
+      </w:rPr>
+    </w:lvl>
+  </w:abstractNum>
+  <w:abstractNum w:abstractNumId="7" w15:restartNumberingAfterBreak="0">
+    <w:nsid w:val="2E924CBB"/>
+    <w:multiLevelType w:val="multilevel"/>
+    <w:tmpl w:val="B17A4454"/>
+    <w:lvl w:ilvl="0">
+      <w:start w:val="1"/>
+      <w:numFmt w:val="bullet"/>
+      <w:lvlText w:val=""/>
+      <w:lvlJc w:val="left"/>
+      <w:pPr>
+        <w:tabs>
+          <w:tab w:val="num" w:pos="720"/>
+        </w:tabs>
+        <w:ind w:left="720" w:hanging="360"/>
+      </w:pPr>
+      <w:rPr>
+        <w:rFonts w:ascii="Symbol" w:hAnsi="Symbol" w:hint="default"/>
+        <w:sz w:val="20"/>
+      </w:rPr>
+    </w:lvl>
+    <w:lvl w:ilvl="1" w:tentative="1">
+      <w:start w:val="1"/>
+      <w:numFmt w:val="bullet"/>
+      <w:lvlText w:val="o"/>
+      <w:lvlJc w:val="left"/>
+      <w:pPr>
+        <w:tabs>
+          <w:tab w:val="num" w:pos="1440"/>
+        </w:tabs>
+        <w:ind w:left="1440" w:hanging="360"/>
+      </w:pPr>
+      <w:rPr>
+        <w:rFonts w:ascii="Courier New" w:hAnsi="Courier New" w:hint="default"/>
+        <w:sz w:val="20"/>
+      </w:rPr>
+    </w:lvl>
+    <w:lvl w:ilvl="2" w:tentative="1">
+      <w:start w:val="1"/>
+      <w:numFmt w:val="bullet"/>
+      <w:lvlText w:val=""/>
+      <w:lvlJc w:val="left"/>
+      <w:pPr>
+        <w:tabs>
+          <w:tab w:val="num" w:pos="2160"/>
+        </w:tabs>
+        <w:ind w:left="2160" w:hanging="360"/>
+      </w:pPr>
+      <w:rPr>
+        <w:rFonts w:ascii="Wingdings" w:hAnsi="Wingdings" w:hint="default"/>
+        <w:sz w:val="20"/>
+      </w:rPr>
+    </w:lvl>
+    <w:lvl w:ilvl="3" w:tentative="1">
+      <w:start w:val="1"/>
+      <w:numFmt w:val="bullet"/>
+      <w:lvlText w:val=""/>
+      <w:lvlJc w:val="left"/>
+      <w:pPr>
+        <w:tabs>
+          <w:tab w:val="num" w:pos="2880"/>
+        </w:tabs>
+        <w:ind w:left="2880" w:hanging="360"/>
+      </w:pPr>
+      <w:rPr>
+        <w:rFonts w:ascii="Wingdings" w:hAnsi="Wingdings" w:hint="default"/>
+        <w:sz w:val="20"/>
+      </w:rPr>
+    </w:lvl>
+    <w:lvl w:ilvl="4" w:tentative="1">
+      <w:start w:val="1"/>
+      <w:numFmt w:val="bullet"/>
+      <w:lvlText w:val=""/>
+      <w:lvlJc w:val="left"/>
+      <w:pPr>
+        <w:tabs>
+          <w:tab w:val="num" w:pos="3600"/>
+        </w:tabs>
+        <w:ind w:left="3600" w:hanging="360"/>
+      </w:pPr>
+      <w:rPr>
+        <w:rFonts w:ascii="Wingdings" w:hAnsi="Wingdings" w:hint="default"/>
+        <w:sz w:val="20"/>
+      </w:rPr>
+    </w:lvl>
+    <w:lvl w:ilvl="5" w:tentative="1">
+      <w:start w:val="1"/>
+      <w:numFmt w:val="bullet"/>
+      <w:lvlText w:val=""/>
+      <w:lvlJc w:val="left"/>
+      <w:pPr>
+        <w:tabs>
+          <w:tab w:val="num" w:pos="4320"/>
+        </w:tabs>
+        <w:ind w:left="4320" w:hanging="360"/>
+      </w:pPr>
+      <w:rPr>
+        <w:rFonts w:ascii="Wingdings" w:hAnsi="Wingdings" w:hint="default"/>
+        <w:sz w:val="20"/>
+      </w:rPr>
+    </w:lvl>
+    <w:lvl w:ilvl="6" w:tentative="1">
+      <w:start w:val="1"/>
+      <w:numFmt w:val="bullet"/>
+      <w:lvlText w:val=""/>
+      <w:lvlJc w:val="left"/>
+      <w:pPr>
+        <w:tabs>
+          <w:tab w:val="num" w:pos="5040"/>
+        </w:tabs>
+        <w:ind w:left="5040" w:hanging="360"/>
+      </w:pPr>
+      <w:rPr>
+        <w:rFonts w:ascii="Wingdings" w:hAnsi="Wingdings" w:hint="default"/>
+        <w:sz w:val="20"/>
+      </w:rPr>
+    </w:lvl>
+    <w:lvl w:ilvl="7" w:tentative="1">
+      <w:start w:val="1"/>
+      <w:numFmt w:val="bullet"/>
+      <w:lvlText w:val=""/>
+      <w:lvlJc w:val="left"/>
+      <w:pPr>
+        <w:tabs>
+          <w:tab w:val="num" w:pos="5760"/>
+        </w:tabs>
+        <w:ind w:left="5760" w:hanging="360"/>
+      </w:pPr>
+      <w:rPr>
+        <w:rFonts w:ascii="Wingdings" w:hAnsi="Wingdings" w:hint="default"/>
+        <w:sz w:val="20"/>
+      </w:rPr>
+    </w:lvl>
+    <w:lvl w:ilvl="8" w:tentative="1">
+      <w:start w:val="1"/>
+      <w:numFmt w:val="bullet"/>
+      <w:lvlText w:val=""/>
+      <w:lvlJc w:val="left"/>
+      <w:pPr>
+        <w:tabs>
+          <w:tab w:val="num" w:pos="6480"/>
+        </w:tabs>
+        <w:ind w:left="6480" w:hanging="360"/>
+      </w:pPr>
+      <w:rPr>
+        <w:rFonts w:ascii="Wingdings" w:hAnsi="Wingdings" w:hint="default"/>
+        <w:sz w:val="20"/>
+      </w:rPr>
+    </w:lvl>
+  </w:abstractNum>
+  <w:abstractNum w:abstractNumId="8" w15:restartNumberingAfterBreak="0">
     <w:nsid w:val="2FBE49AA"/>
     <w:multiLevelType w:val="multilevel"/>
     <w:tmpl w:val="7D26904C"/>
@@ -5317,7 +6853,7 @@
       </w:rPr>
     </w:lvl>
   </w:abstractNum>
-  <w:abstractNum w:abstractNumId="5" w15:restartNumberingAfterBreak="0">
+  <w:abstractNum w:abstractNumId="9" w15:restartNumberingAfterBreak="0">
     <w:nsid w:val="387A7101"/>
     <w:multiLevelType w:val="multilevel"/>
     <w:tmpl w:val="05784362"/>
@@ -5466,7 +7002,7 @@
       </w:rPr>
     </w:lvl>
   </w:abstractNum>
-  <w:abstractNum w:abstractNumId="6" w15:restartNumberingAfterBreak="0">
+  <w:abstractNum w:abstractNumId="10" w15:restartNumberingAfterBreak="0">
     <w:nsid w:val="3899730A"/>
     <w:multiLevelType w:val="multilevel"/>
     <w:tmpl w:val="2DD476DE"/>
@@ -5615,7 +7151,7 @@
       </w:rPr>
     </w:lvl>
   </w:abstractNum>
-  <w:abstractNum w:abstractNumId="7" w15:restartNumberingAfterBreak="0">
+  <w:abstractNum w:abstractNumId="11" w15:restartNumberingAfterBreak="0">
     <w:nsid w:val="3CA82F84"/>
     <w:multiLevelType w:val="multilevel"/>
     <w:tmpl w:val="5448A8DA"/>
@@ -5764,7 +7300,7 @@
       </w:rPr>
     </w:lvl>
   </w:abstractNum>
-  <w:abstractNum w:abstractNumId="8" w15:restartNumberingAfterBreak="0">
+  <w:abstractNum w:abstractNumId="12" w15:restartNumberingAfterBreak="0">
     <w:nsid w:val="470673C9"/>
     <w:multiLevelType w:val="multilevel"/>
     <w:tmpl w:val="0EA4E8DC"/>
@@ -5913,7 +7449,305 @@
       </w:rPr>
     </w:lvl>
   </w:abstractNum>
-  <w:abstractNum w:abstractNumId="9" w15:restartNumberingAfterBreak="0">
+  <w:abstractNum w:abstractNumId="13" w15:restartNumberingAfterBreak="0">
+    <w:nsid w:val="4BEB4DEE"/>
+    <w:multiLevelType w:val="multilevel"/>
+    <w:tmpl w:val="F352462C"/>
+    <w:lvl w:ilvl="0">
+      <w:start w:val="1"/>
+      <w:numFmt w:val="bullet"/>
+      <w:lvlText w:val=""/>
+      <w:lvlJc w:val="left"/>
+      <w:pPr>
+        <w:tabs>
+          <w:tab w:val="num" w:pos="720"/>
+        </w:tabs>
+        <w:ind w:left="720" w:hanging="360"/>
+      </w:pPr>
+      <w:rPr>
+        <w:rFonts w:ascii="Symbol" w:hAnsi="Symbol" w:hint="default"/>
+        <w:sz w:val="20"/>
+      </w:rPr>
+    </w:lvl>
+    <w:lvl w:ilvl="1" w:tentative="1">
+      <w:start w:val="1"/>
+      <w:numFmt w:val="bullet"/>
+      <w:lvlText w:val="o"/>
+      <w:lvlJc w:val="left"/>
+      <w:pPr>
+        <w:tabs>
+          <w:tab w:val="num" w:pos="1440"/>
+        </w:tabs>
+        <w:ind w:left="1440" w:hanging="360"/>
+      </w:pPr>
+      <w:rPr>
+        <w:rFonts w:ascii="Courier New" w:hAnsi="Courier New" w:hint="default"/>
+        <w:sz w:val="20"/>
+      </w:rPr>
+    </w:lvl>
+    <w:lvl w:ilvl="2" w:tentative="1">
+      <w:start w:val="1"/>
+      <w:numFmt w:val="bullet"/>
+      <w:lvlText w:val=""/>
+      <w:lvlJc w:val="left"/>
+      <w:pPr>
+        <w:tabs>
+          <w:tab w:val="num" w:pos="2160"/>
+        </w:tabs>
+        <w:ind w:left="2160" w:hanging="360"/>
+      </w:pPr>
+      <w:rPr>
+        <w:rFonts w:ascii="Wingdings" w:hAnsi="Wingdings" w:hint="default"/>
+        <w:sz w:val="20"/>
+      </w:rPr>
+    </w:lvl>
+    <w:lvl w:ilvl="3" w:tentative="1">
+      <w:start w:val="1"/>
+      <w:numFmt w:val="bullet"/>
+      <w:lvlText w:val=""/>
+      <w:lvlJc w:val="left"/>
+      <w:pPr>
+        <w:tabs>
+          <w:tab w:val="num" w:pos="2880"/>
+        </w:tabs>
+        <w:ind w:left="2880" w:hanging="360"/>
+      </w:pPr>
+      <w:rPr>
+        <w:rFonts w:ascii="Wingdings" w:hAnsi="Wingdings" w:hint="default"/>
+        <w:sz w:val="20"/>
+      </w:rPr>
+    </w:lvl>
+    <w:lvl w:ilvl="4" w:tentative="1">
+      <w:start w:val="1"/>
+      <w:numFmt w:val="bullet"/>
+      <w:lvlText w:val=""/>
+      <w:lvlJc w:val="left"/>
+      <w:pPr>
+        <w:tabs>
+          <w:tab w:val="num" w:pos="3600"/>
+        </w:tabs>
+        <w:ind w:left="3600" w:hanging="360"/>
+      </w:pPr>
+      <w:rPr>
+        <w:rFonts w:ascii="Wingdings" w:hAnsi="Wingdings" w:hint="default"/>
+        <w:sz w:val="20"/>
+      </w:rPr>
+    </w:lvl>
+    <w:lvl w:ilvl="5" w:tentative="1">
+      <w:start w:val="1"/>
+      <w:numFmt w:val="bullet"/>
+      <w:lvlText w:val=""/>
+      <w:lvlJc w:val="left"/>
+      <w:pPr>
+        <w:tabs>
+          <w:tab w:val="num" w:pos="4320"/>
+        </w:tabs>
+        <w:ind w:left="4320" w:hanging="360"/>
+      </w:pPr>
+      <w:rPr>
+        <w:rFonts w:ascii="Wingdings" w:hAnsi="Wingdings" w:hint="default"/>
+        <w:sz w:val="20"/>
+      </w:rPr>
+    </w:lvl>
+    <w:lvl w:ilvl="6" w:tentative="1">
+      <w:start w:val="1"/>
+      <w:numFmt w:val="bullet"/>
+      <w:lvlText w:val=""/>
+      <w:lvlJc w:val="left"/>
+      <w:pPr>
+        <w:tabs>
+          <w:tab w:val="num" w:pos="5040"/>
+        </w:tabs>
+        <w:ind w:left="5040" w:hanging="360"/>
+      </w:pPr>
+      <w:rPr>
+        <w:rFonts w:ascii="Wingdings" w:hAnsi="Wingdings" w:hint="default"/>
+        <w:sz w:val="20"/>
+      </w:rPr>
+    </w:lvl>
+    <w:lvl w:ilvl="7" w:tentative="1">
+      <w:start w:val="1"/>
+      <w:numFmt w:val="bullet"/>
+      <w:lvlText w:val=""/>
+      <w:lvlJc w:val="left"/>
+      <w:pPr>
+        <w:tabs>
+          <w:tab w:val="num" w:pos="5760"/>
+        </w:tabs>
+        <w:ind w:left="5760" w:hanging="360"/>
+      </w:pPr>
+      <w:rPr>
+        <w:rFonts w:ascii="Wingdings" w:hAnsi="Wingdings" w:hint="default"/>
+        <w:sz w:val="20"/>
+      </w:rPr>
+    </w:lvl>
+    <w:lvl w:ilvl="8" w:tentative="1">
+      <w:start w:val="1"/>
+      <w:numFmt w:val="bullet"/>
+      <w:lvlText w:val=""/>
+      <w:lvlJc w:val="left"/>
+      <w:pPr>
+        <w:tabs>
+          <w:tab w:val="num" w:pos="6480"/>
+        </w:tabs>
+        <w:ind w:left="6480" w:hanging="360"/>
+      </w:pPr>
+      <w:rPr>
+        <w:rFonts w:ascii="Wingdings" w:hAnsi="Wingdings" w:hint="default"/>
+        <w:sz w:val="20"/>
+      </w:rPr>
+    </w:lvl>
+  </w:abstractNum>
+  <w:abstractNum w:abstractNumId="14" w15:restartNumberingAfterBreak="0">
+    <w:nsid w:val="4D2A7A42"/>
+    <w:multiLevelType w:val="multilevel"/>
+    <w:tmpl w:val="25EAE86E"/>
+    <w:lvl w:ilvl="0">
+      <w:start w:val="1"/>
+      <w:numFmt w:val="bullet"/>
+      <w:lvlText w:val=""/>
+      <w:lvlJc w:val="left"/>
+      <w:pPr>
+        <w:tabs>
+          <w:tab w:val="num" w:pos="720"/>
+        </w:tabs>
+        <w:ind w:left="720" w:hanging="360"/>
+      </w:pPr>
+      <w:rPr>
+        <w:rFonts w:ascii="Symbol" w:hAnsi="Symbol" w:hint="default"/>
+        <w:sz w:val="20"/>
+      </w:rPr>
+    </w:lvl>
+    <w:lvl w:ilvl="1" w:tentative="1">
+      <w:start w:val="1"/>
+      <w:numFmt w:val="bullet"/>
+      <w:lvlText w:val="o"/>
+      <w:lvlJc w:val="left"/>
+      <w:pPr>
+        <w:tabs>
+          <w:tab w:val="num" w:pos="1440"/>
+        </w:tabs>
+        <w:ind w:left="1440" w:hanging="360"/>
+      </w:pPr>
+      <w:rPr>
+        <w:rFonts w:ascii="Courier New" w:hAnsi="Courier New" w:hint="default"/>
+        <w:sz w:val="20"/>
+      </w:rPr>
+    </w:lvl>
+    <w:lvl w:ilvl="2" w:tentative="1">
+      <w:start w:val="1"/>
+      <w:numFmt w:val="bullet"/>
+      <w:lvlText w:val=""/>
+      <w:lvlJc w:val="left"/>
+      <w:pPr>
+        <w:tabs>
+          <w:tab w:val="num" w:pos="2160"/>
+        </w:tabs>
+        <w:ind w:left="2160" w:hanging="360"/>
+      </w:pPr>
+      <w:rPr>
+        <w:rFonts w:ascii="Wingdings" w:hAnsi="Wingdings" w:hint="default"/>
+        <w:sz w:val="20"/>
+      </w:rPr>
+    </w:lvl>
+    <w:lvl w:ilvl="3" w:tentative="1">
+      <w:start w:val="1"/>
+      <w:numFmt w:val="bullet"/>
+      <w:lvlText w:val=""/>
+      <w:lvlJc w:val="left"/>
+      <w:pPr>
+        <w:tabs>
+          <w:tab w:val="num" w:pos="2880"/>
+        </w:tabs>
+        <w:ind w:left="2880" w:hanging="360"/>
+      </w:pPr>
+      <w:rPr>
+        <w:rFonts w:ascii="Wingdings" w:hAnsi="Wingdings" w:hint="default"/>
+        <w:sz w:val="20"/>
+      </w:rPr>
+    </w:lvl>
+    <w:lvl w:ilvl="4" w:tentative="1">
+      <w:start w:val="1"/>
+      <w:numFmt w:val="bullet"/>
+      <w:lvlText w:val=""/>
+      <w:lvlJc w:val="left"/>
+      <w:pPr>
+        <w:tabs>
+          <w:tab w:val="num" w:pos="3600"/>
+        </w:tabs>
+        <w:ind w:left="3600" w:hanging="360"/>
+      </w:pPr>
+      <w:rPr>
+        <w:rFonts w:ascii="Wingdings" w:hAnsi="Wingdings" w:hint="default"/>
+        <w:sz w:val="20"/>
+      </w:rPr>
+    </w:lvl>
+    <w:lvl w:ilvl="5" w:tentative="1">
+      <w:start w:val="1"/>
+      <w:numFmt w:val="bullet"/>
+      <w:lvlText w:val=""/>
+      <w:lvlJc w:val="left"/>
+      <w:pPr>
+        <w:tabs>
+          <w:tab w:val="num" w:pos="4320"/>
+        </w:tabs>
+        <w:ind w:left="4320" w:hanging="360"/>
+      </w:pPr>
+      <w:rPr>
+        <w:rFonts w:ascii="Wingdings" w:hAnsi="Wingdings" w:hint="default"/>
+        <w:sz w:val="20"/>
+      </w:rPr>
+    </w:lvl>
+    <w:lvl w:ilvl="6" w:tentative="1">
+      <w:start w:val="1"/>
+      <w:numFmt w:val="bullet"/>
+      <w:lvlText w:val=""/>
+      <w:lvlJc w:val="left"/>
+      <w:pPr>
+        <w:tabs>
+          <w:tab w:val="num" w:pos="5040"/>
+        </w:tabs>
+        <w:ind w:left="5040" w:hanging="360"/>
+      </w:pPr>
+      <w:rPr>
+        <w:rFonts w:ascii="Wingdings" w:hAnsi="Wingdings" w:hint="default"/>
+        <w:sz w:val="20"/>
+      </w:rPr>
+    </w:lvl>
+    <w:lvl w:ilvl="7" w:tentative="1">
+      <w:start w:val="1"/>
+      <w:numFmt w:val="bullet"/>
+      <w:lvlText w:val=""/>
+      <w:lvlJc w:val="left"/>
+      <w:pPr>
+        <w:tabs>
+          <w:tab w:val="num" w:pos="5760"/>
+        </w:tabs>
+        <w:ind w:left="5760" w:hanging="360"/>
+      </w:pPr>
+      <w:rPr>
+        <w:rFonts w:ascii="Wingdings" w:hAnsi="Wingdings" w:hint="default"/>
+        <w:sz w:val="20"/>
+      </w:rPr>
+    </w:lvl>
+    <w:lvl w:ilvl="8" w:tentative="1">
+      <w:start w:val="1"/>
+      <w:numFmt w:val="bullet"/>
+      <w:lvlText w:val=""/>
+      <w:lvlJc w:val="left"/>
+      <w:pPr>
+        <w:tabs>
+          <w:tab w:val="num" w:pos="6480"/>
+        </w:tabs>
+        <w:ind w:left="6480" w:hanging="360"/>
+      </w:pPr>
+      <w:rPr>
+        <w:rFonts w:ascii="Wingdings" w:hAnsi="Wingdings" w:hint="default"/>
+        <w:sz w:val="20"/>
+      </w:rPr>
+    </w:lvl>
+  </w:abstractNum>
+  <w:abstractNum w:abstractNumId="15" w15:restartNumberingAfterBreak="0">
     <w:nsid w:val="508D061E"/>
     <w:multiLevelType w:val="multilevel"/>
     <w:tmpl w:val="D8385B1E"/>
@@ -6062,7 +7896,7 @@
       </w:rPr>
     </w:lvl>
   </w:abstractNum>
-  <w:abstractNum w:abstractNumId="10" w15:restartNumberingAfterBreak="0">
+  <w:abstractNum w:abstractNumId="16" w15:restartNumberingAfterBreak="0">
     <w:nsid w:val="58A86BDF"/>
     <w:multiLevelType w:val="multilevel"/>
     <w:tmpl w:val="4184E944"/>
@@ -6211,7 +8045,305 @@
       </w:rPr>
     </w:lvl>
   </w:abstractNum>
-  <w:abstractNum w:abstractNumId="11" w15:restartNumberingAfterBreak="0">
+  <w:abstractNum w:abstractNumId="17" w15:restartNumberingAfterBreak="0">
+    <w:nsid w:val="5DE450BF"/>
+    <w:multiLevelType w:val="multilevel"/>
+    <w:tmpl w:val="F2A8CB56"/>
+    <w:lvl w:ilvl="0">
+      <w:start w:val="1"/>
+      <w:numFmt w:val="bullet"/>
+      <w:lvlText w:val=""/>
+      <w:lvlJc w:val="left"/>
+      <w:pPr>
+        <w:tabs>
+          <w:tab w:val="num" w:pos="720"/>
+        </w:tabs>
+        <w:ind w:left="720" w:hanging="360"/>
+      </w:pPr>
+      <w:rPr>
+        <w:rFonts w:ascii="Symbol" w:hAnsi="Symbol" w:hint="default"/>
+        <w:sz w:val="20"/>
+      </w:rPr>
+    </w:lvl>
+    <w:lvl w:ilvl="1" w:tentative="1">
+      <w:start w:val="1"/>
+      <w:numFmt w:val="bullet"/>
+      <w:lvlText w:val="o"/>
+      <w:lvlJc w:val="left"/>
+      <w:pPr>
+        <w:tabs>
+          <w:tab w:val="num" w:pos="1440"/>
+        </w:tabs>
+        <w:ind w:left="1440" w:hanging="360"/>
+      </w:pPr>
+      <w:rPr>
+        <w:rFonts w:ascii="Courier New" w:hAnsi="Courier New" w:hint="default"/>
+        <w:sz w:val="20"/>
+      </w:rPr>
+    </w:lvl>
+    <w:lvl w:ilvl="2" w:tentative="1">
+      <w:start w:val="1"/>
+      <w:numFmt w:val="bullet"/>
+      <w:lvlText w:val=""/>
+      <w:lvlJc w:val="left"/>
+      <w:pPr>
+        <w:tabs>
+          <w:tab w:val="num" w:pos="2160"/>
+        </w:tabs>
+        <w:ind w:left="2160" w:hanging="360"/>
+      </w:pPr>
+      <w:rPr>
+        <w:rFonts w:ascii="Wingdings" w:hAnsi="Wingdings" w:hint="default"/>
+        <w:sz w:val="20"/>
+      </w:rPr>
+    </w:lvl>
+    <w:lvl w:ilvl="3" w:tentative="1">
+      <w:start w:val="1"/>
+      <w:numFmt w:val="bullet"/>
+      <w:lvlText w:val=""/>
+      <w:lvlJc w:val="left"/>
+      <w:pPr>
+        <w:tabs>
+          <w:tab w:val="num" w:pos="2880"/>
+        </w:tabs>
+        <w:ind w:left="2880" w:hanging="360"/>
+      </w:pPr>
+      <w:rPr>
+        <w:rFonts w:ascii="Wingdings" w:hAnsi="Wingdings" w:hint="default"/>
+        <w:sz w:val="20"/>
+      </w:rPr>
+    </w:lvl>
+    <w:lvl w:ilvl="4" w:tentative="1">
+      <w:start w:val="1"/>
+      <w:numFmt w:val="bullet"/>
+      <w:lvlText w:val=""/>
+      <w:lvlJc w:val="left"/>
+      <w:pPr>
+        <w:tabs>
+          <w:tab w:val="num" w:pos="3600"/>
+        </w:tabs>
+        <w:ind w:left="3600" w:hanging="360"/>
+      </w:pPr>
+      <w:rPr>
+        <w:rFonts w:ascii="Wingdings" w:hAnsi="Wingdings" w:hint="default"/>
+        <w:sz w:val="20"/>
+      </w:rPr>
+    </w:lvl>
+    <w:lvl w:ilvl="5" w:tentative="1">
+      <w:start w:val="1"/>
+      <w:numFmt w:val="bullet"/>
+      <w:lvlText w:val=""/>
+      <w:lvlJc w:val="left"/>
+      <w:pPr>
+        <w:tabs>
+          <w:tab w:val="num" w:pos="4320"/>
+        </w:tabs>
+        <w:ind w:left="4320" w:hanging="360"/>
+      </w:pPr>
+      <w:rPr>
+        <w:rFonts w:ascii="Wingdings" w:hAnsi="Wingdings" w:hint="default"/>
+        <w:sz w:val="20"/>
+      </w:rPr>
+    </w:lvl>
+    <w:lvl w:ilvl="6" w:tentative="1">
+      <w:start w:val="1"/>
+      <w:numFmt w:val="bullet"/>
+      <w:lvlText w:val=""/>
+      <w:lvlJc w:val="left"/>
+      <w:pPr>
+        <w:tabs>
+          <w:tab w:val="num" w:pos="5040"/>
+        </w:tabs>
+        <w:ind w:left="5040" w:hanging="360"/>
+      </w:pPr>
+      <w:rPr>
+        <w:rFonts w:ascii="Wingdings" w:hAnsi="Wingdings" w:hint="default"/>
+        <w:sz w:val="20"/>
+      </w:rPr>
+    </w:lvl>
+    <w:lvl w:ilvl="7" w:tentative="1">
+      <w:start w:val="1"/>
+      <w:numFmt w:val="bullet"/>
+      <w:lvlText w:val=""/>
+      <w:lvlJc w:val="left"/>
+      <w:pPr>
+        <w:tabs>
+          <w:tab w:val="num" w:pos="5760"/>
+        </w:tabs>
+        <w:ind w:left="5760" w:hanging="360"/>
+      </w:pPr>
+      <w:rPr>
+        <w:rFonts w:ascii="Wingdings" w:hAnsi="Wingdings" w:hint="default"/>
+        <w:sz w:val="20"/>
+      </w:rPr>
+    </w:lvl>
+    <w:lvl w:ilvl="8" w:tentative="1">
+      <w:start w:val="1"/>
+      <w:numFmt w:val="bullet"/>
+      <w:lvlText w:val=""/>
+      <w:lvlJc w:val="left"/>
+      <w:pPr>
+        <w:tabs>
+          <w:tab w:val="num" w:pos="6480"/>
+        </w:tabs>
+        <w:ind w:left="6480" w:hanging="360"/>
+      </w:pPr>
+      <w:rPr>
+        <w:rFonts w:ascii="Wingdings" w:hAnsi="Wingdings" w:hint="default"/>
+        <w:sz w:val="20"/>
+      </w:rPr>
+    </w:lvl>
+  </w:abstractNum>
+  <w:abstractNum w:abstractNumId="18" w15:restartNumberingAfterBreak="0">
+    <w:nsid w:val="5E9E2DE1"/>
+    <w:multiLevelType w:val="multilevel"/>
+    <w:tmpl w:val="BE50A988"/>
+    <w:lvl w:ilvl="0">
+      <w:start w:val="1"/>
+      <w:numFmt w:val="bullet"/>
+      <w:lvlText w:val=""/>
+      <w:lvlJc w:val="left"/>
+      <w:pPr>
+        <w:tabs>
+          <w:tab w:val="num" w:pos="720"/>
+        </w:tabs>
+        <w:ind w:left="720" w:hanging="360"/>
+      </w:pPr>
+      <w:rPr>
+        <w:rFonts w:ascii="Symbol" w:hAnsi="Symbol" w:hint="default"/>
+        <w:sz w:val="20"/>
+      </w:rPr>
+    </w:lvl>
+    <w:lvl w:ilvl="1">
+      <w:start w:val="1"/>
+      <w:numFmt w:val="bullet"/>
+      <w:lvlText w:val="o"/>
+      <w:lvlJc w:val="left"/>
+      <w:pPr>
+        <w:tabs>
+          <w:tab w:val="num" w:pos="1440"/>
+        </w:tabs>
+        <w:ind w:left="1440" w:hanging="360"/>
+      </w:pPr>
+      <w:rPr>
+        <w:rFonts w:ascii="Courier New" w:hAnsi="Courier New" w:hint="default"/>
+        <w:sz w:val="20"/>
+      </w:rPr>
+    </w:lvl>
+    <w:lvl w:ilvl="2" w:tentative="1">
+      <w:start w:val="1"/>
+      <w:numFmt w:val="bullet"/>
+      <w:lvlText w:val=""/>
+      <w:lvlJc w:val="left"/>
+      <w:pPr>
+        <w:tabs>
+          <w:tab w:val="num" w:pos="2160"/>
+        </w:tabs>
+        <w:ind w:left="2160" w:hanging="360"/>
+      </w:pPr>
+      <w:rPr>
+        <w:rFonts w:ascii="Wingdings" w:hAnsi="Wingdings" w:hint="default"/>
+        <w:sz w:val="20"/>
+      </w:rPr>
+    </w:lvl>
+    <w:lvl w:ilvl="3" w:tentative="1">
+      <w:start w:val="1"/>
+      <w:numFmt w:val="bullet"/>
+      <w:lvlText w:val=""/>
+      <w:lvlJc w:val="left"/>
+      <w:pPr>
+        <w:tabs>
+          <w:tab w:val="num" w:pos="2880"/>
+        </w:tabs>
+        <w:ind w:left="2880" w:hanging="360"/>
+      </w:pPr>
+      <w:rPr>
+        <w:rFonts w:ascii="Wingdings" w:hAnsi="Wingdings" w:hint="default"/>
+        <w:sz w:val="20"/>
+      </w:rPr>
+    </w:lvl>
+    <w:lvl w:ilvl="4" w:tentative="1">
+      <w:start w:val="1"/>
+      <w:numFmt w:val="bullet"/>
+      <w:lvlText w:val=""/>
+      <w:lvlJc w:val="left"/>
+      <w:pPr>
+        <w:tabs>
+          <w:tab w:val="num" w:pos="3600"/>
+        </w:tabs>
+        <w:ind w:left="3600" w:hanging="360"/>
+      </w:pPr>
+      <w:rPr>
+        <w:rFonts w:ascii="Wingdings" w:hAnsi="Wingdings" w:hint="default"/>
+        <w:sz w:val="20"/>
+      </w:rPr>
+    </w:lvl>
+    <w:lvl w:ilvl="5" w:tentative="1">
+      <w:start w:val="1"/>
+      <w:numFmt w:val="bullet"/>
+      <w:lvlText w:val=""/>
+      <w:lvlJc w:val="left"/>
+      <w:pPr>
+        <w:tabs>
+          <w:tab w:val="num" w:pos="4320"/>
+        </w:tabs>
+        <w:ind w:left="4320" w:hanging="360"/>
+      </w:pPr>
+      <w:rPr>
+        <w:rFonts w:ascii="Wingdings" w:hAnsi="Wingdings" w:hint="default"/>
+        <w:sz w:val="20"/>
+      </w:rPr>
+    </w:lvl>
+    <w:lvl w:ilvl="6" w:tentative="1">
+      <w:start w:val="1"/>
+      <w:numFmt w:val="bullet"/>
+      <w:lvlText w:val=""/>
+      <w:lvlJc w:val="left"/>
+      <w:pPr>
+        <w:tabs>
+          <w:tab w:val="num" w:pos="5040"/>
+        </w:tabs>
+        <w:ind w:left="5040" w:hanging="360"/>
+      </w:pPr>
+      <w:rPr>
+        <w:rFonts w:ascii="Wingdings" w:hAnsi="Wingdings" w:hint="default"/>
+        <w:sz w:val="20"/>
+      </w:rPr>
+    </w:lvl>
+    <w:lvl w:ilvl="7" w:tentative="1">
+      <w:start w:val="1"/>
+      <w:numFmt w:val="bullet"/>
+      <w:lvlText w:val=""/>
+      <w:lvlJc w:val="left"/>
+      <w:pPr>
+        <w:tabs>
+          <w:tab w:val="num" w:pos="5760"/>
+        </w:tabs>
+        <w:ind w:left="5760" w:hanging="360"/>
+      </w:pPr>
+      <w:rPr>
+        <w:rFonts w:ascii="Wingdings" w:hAnsi="Wingdings" w:hint="default"/>
+        <w:sz w:val="20"/>
+      </w:rPr>
+    </w:lvl>
+    <w:lvl w:ilvl="8" w:tentative="1">
+      <w:start w:val="1"/>
+      <w:numFmt w:val="bullet"/>
+      <w:lvlText w:val=""/>
+      <w:lvlJc w:val="left"/>
+      <w:pPr>
+        <w:tabs>
+          <w:tab w:val="num" w:pos="6480"/>
+        </w:tabs>
+        <w:ind w:left="6480" w:hanging="360"/>
+      </w:pPr>
+      <w:rPr>
+        <w:rFonts w:ascii="Wingdings" w:hAnsi="Wingdings" w:hint="default"/>
+        <w:sz w:val="20"/>
+      </w:rPr>
+    </w:lvl>
+  </w:abstractNum>
+  <w:abstractNum w:abstractNumId="19" w15:restartNumberingAfterBreak="0">
     <w:nsid w:val="64D76577"/>
     <w:multiLevelType w:val="multilevel"/>
     <w:tmpl w:val="0EA4E8DC"/>
@@ -6360,7 +8492,7 @@
       </w:rPr>
     </w:lvl>
   </w:abstractNum>
-  <w:abstractNum w:abstractNumId="12" w15:restartNumberingAfterBreak="0">
+  <w:abstractNum w:abstractNumId="20" w15:restartNumberingAfterBreak="0">
     <w:nsid w:val="6A3002F9"/>
     <w:multiLevelType w:val="multilevel"/>
     <w:tmpl w:val="86308384"/>
@@ -6509,7 +8641,7 @@
       </w:rPr>
     </w:lvl>
   </w:abstractNum>
-  <w:abstractNum w:abstractNumId="13" w15:restartNumberingAfterBreak="0">
+  <w:abstractNum w:abstractNumId="21" w15:restartNumberingAfterBreak="0">
     <w:nsid w:val="6B4B7528"/>
     <w:multiLevelType w:val="multilevel"/>
     <w:tmpl w:val="0EA4E8DC"/>
@@ -6658,7 +8790,7 @@
       </w:rPr>
     </w:lvl>
   </w:abstractNum>
-  <w:abstractNum w:abstractNumId="14" w15:restartNumberingAfterBreak="0">
+  <w:abstractNum w:abstractNumId="22" w15:restartNumberingAfterBreak="0">
     <w:nsid w:val="764C1FE1"/>
     <w:multiLevelType w:val="hybridMultilevel"/>
     <w:tmpl w:val="6D1AD7F6"/>
@@ -6771,7 +8903,7 @@
       </w:rPr>
     </w:lvl>
   </w:abstractNum>
-  <w:abstractNum w:abstractNumId="15" w15:restartNumberingAfterBreak="0">
+  <w:abstractNum w:abstractNumId="23" w15:restartNumberingAfterBreak="0">
     <w:nsid w:val="77A55077"/>
     <w:multiLevelType w:val="multilevel"/>
     <w:tmpl w:val="37F41CF6"/>
@@ -6920,7 +9052,7 @@
       </w:rPr>
     </w:lvl>
   </w:abstractNum>
-  <w:abstractNum w:abstractNumId="16" w15:restartNumberingAfterBreak="0">
+  <w:abstractNum w:abstractNumId="24" w15:restartNumberingAfterBreak="0">
     <w:nsid w:val="78911A9D"/>
     <w:multiLevelType w:val="multilevel"/>
     <w:tmpl w:val="7F6E4736"/>
@@ -7069,7 +9201,7 @@
       </w:rPr>
     </w:lvl>
   </w:abstractNum>
-  <w:abstractNum w:abstractNumId="17" w15:restartNumberingAfterBreak="0">
+  <w:abstractNum w:abstractNumId="25" w15:restartNumberingAfterBreak="0">
     <w:nsid w:val="78A47FEA"/>
     <w:multiLevelType w:val="hybridMultilevel"/>
     <w:tmpl w:val="FD1CA190"/>
@@ -7158,59 +9290,203 @@
       </w:pPr>
     </w:lvl>
   </w:abstractNum>
+  <w:abstractNum w:abstractNumId="26" w15:restartNumberingAfterBreak="0">
+    <w:nsid w:val="7E961E89"/>
+    <w:multiLevelType w:val="multilevel"/>
+    <w:tmpl w:val="51A20EB8"/>
+    <w:lvl w:ilvl="0">
+      <w:start w:val="1"/>
+      <w:numFmt w:val="decimal"/>
+      <w:lvlText w:val="%1."/>
+      <w:lvlJc w:val="left"/>
+      <w:pPr>
+        <w:tabs>
+          <w:tab w:val="num" w:pos="720"/>
+        </w:tabs>
+        <w:ind w:left="720" w:hanging="360"/>
+      </w:pPr>
+    </w:lvl>
+    <w:lvl w:ilvl="1">
+      <w:start w:val="1"/>
+      <w:numFmt w:val="bullet"/>
+      <w:lvlText w:val="o"/>
+      <w:lvlJc w:val="left"/>
+      <w:pPr>
+        <w:tabs>
+          <w:tab w:val="num" w:pos="1440"/>
+        </w:tabs>
+        <w:ind w:left="1440" w:hanging="360"/>
+      </w:pPr>
+      <w:rPr>
+        <w:rFonts w:ascii="Courier New" w:hAnsi="Courier New" w:hint="default"/>
+        <w:sz w:val="20"/>
+      </w:rPr>
+    </w:lvl>
+    <w:lvl w:ilvl="2" w:tentative="1">
+      <w:start w:val="1"/>
+      <w:numFmt w:val="decimal"/>
+      <w:lvlText w:val="%3."/>
+      <w:lvlJc w:val="left"/>
+      <w:pPr>
+        <w:tabs>
+          <w:tab w:val="num" w:pos="2160"/>
+        </w:tabs>
+        <w:ind w:left="2160" w:hanging="360"/>
+      </w:pPr>
+    </w:lvl>
+    <w:lvl w:ilvl="3" w:tentative="1">
+      <w:start w:val="1"/>
+      <w:numFmt w:val="decimal"/>
+      <w:lvlText w:val="%4."/>
+      <w:lvlJc w:val="left"/>
+      <w:pPr>
+        <w:tabs>
+          <w:tab w:val="num" w:pos="2880"/>
+        </w:tabs>
+        <w:ind w:left="2880" w:hanging="360"/>
+      </w:pPr>
+    </w:lvl>
+    <w:lvl w:ilvl="4" w:tentative="1">
+      <w:start w:val="1"/>
+      <w:numFmt w:val="decimal"/>
+      <w:lvlText w:val="%5."/>
+      <w:lvlJc w:val="left"/>
+      <w:pPr>
+        <w:tabs>
+          <w:tab w:val="num" w:pos="3600"/>
+        </w:tabs>
+        <w:ind w:left="3600" w:hanging="360"/>
+      </w:pPr>
+    </w:lvl>
+    <w:lvl w:ilvl="5" w:tentative="1">
+      <w:start w:val="1"/>
+      <w:numFmt w:val="decimal"/>
+      <w:lvlText w:val="%6."/>
+      <w:lvlJc w:val="left"/>
+      <w:pPr>
+        <w:tabs>
+          <w:tab w:val="num" w:pos="4320"/>
+        </w:tabs>
+        <w:ind w:left="4320" w:hanging="360"/>
+      </w:pPr>
+    </w:lvl>
+    <w:lvl w:ilvl="6" w:tentative="1">
+      <w:start w:val="1"/>
+      <w:numFmt w:val="decimal"/>
+      <w:lvlText w:val="%7."/>
+      <w:lvlJc w:val="left"/>
+      <w:pPr>
+        <w:tabs>
+          <w:tab w:val="num" w:pos="5040"/>
+        </w:tabs>
+        <w:ind w:left="5040" w:hanging="360"/>
+      </w:pPr>
+    </w:lvl>
+    <w:lvl w:ilvl="7" w:tentative="1">
+      <w:start w:val="1"/>
+      <w:numFmt w:val="decimal"/>
+      <w:lvlText w:val="%8."/>
+      <w:lvlJc w:val="left"/>
+      <w:pPr>
+        <w:tabs>
+          <w:tab w:val="num" w:pos="5760"/>
+        </w:tabs>
+        <w:ind w:left="5760" w:hanging="360"/>
+      </w:pPr>
+    </w:lvl>
+    <w:lvl w:ilvl="8" w:tentative="1">
+      <w:start w:val="1"/>
+      <w:numFmt w:val="decimal"/>
+      <w:lvlText w:val="%9."/>
+      <w:lvlJc w:val="left"/>
+      <w:pPr>
+        <w:tabs>
+          <w:tab w:val="num" w:pos="6480"/>
+        </w:tabs>
+        <w:ind w:left="6480" w:hanging="360"/>
+      </w:pPr>
+    </w:lvl>
+  </w:abstractNum>
   <w:num w:numId="1">
+    <w:abstractNumId w:val="8"/>
+  </w:num>
+  <w:num w:numId="2">
+    <w:abstractNumId w:val="5"/>
+  </w:num>
+  <w:num w:numId="3">
+    <w:abstractNumId w:val="16"/>
+  </w:num>
+  <w:num w:numId="4">
+    <w:abstractNumId w:val="9"/>
+  </w:num>
+  <w:num w:numId="5">
+    <w:abstractNumId w:val="25"/>
+  </w:num>
+  <w:num w:numId="6">
+    <w:abstractNumId w:val="1"/>
+  </w:num>
+  <w:num w:numId="7">
+    <w:abstractNumId w:val="20"/>
+  </w:num>
+  <w:num w:numId="8">
+    <w:abstractNumId w:val="24"/>
+  </w:num>
+  <w:num w:numId="9">
+    <w:abstractNumId w:val="10"/>
+  </w:num>
+  <w:num w:numId="10">
+    <w:abstractNumId w:val="15"/>
+  </w:num>
+  <w:num w:numId="11">
+    <w:abstractNumId w:val="23"/>
+  </w:num>
+  <w:num w:numId="12">
+    <w:abstractNumId w:val="11"/>
+  </w:num>
+  <w:num w:numId="13">
+    <w:abstractNumId w:val="2"/>
+  </w:num>
+  <w:num w:numId="14">
+    <w:abstractNumId w:val="19"/>
+  </w:num>
+  <w:num w:numId="15">
+    <w:abstractNumId w:val="12"/>
+  </w:num>
+  <w:num w:numId="16">
+    <w:abstractNumId w:val="3"/>
+  </w:num>
+  <w:num w:numId="17">
+    <w:abstractNumId w:val="21"/>
+  </w:num>
+  <w:num w:numId="18">
+    <w:abstractNumId w:val="22"/>
+  </w:num>
+  <w:num w:numId="19">
+    <w:abstractNumId w:val="26"/>
+  </w:num>
+  <w:num w:numId="20">
+    <w:abstractNumId w:val="7"/>
+  </w:num>
+  <w:num w:numId="21">
+    <w:abstractNumId w:val="13"/>
+  </w:num>
+  <w:num w:numId="22">
+    <w:abstractNumId w:val="14"/>
+  </w:num>
+  <w:num w:numId="23">
     <w:abstractNumId w:val="4"/>
   </w:num>
-  <w:num w:numId="2">
-    <w:abstractNumId w:val="3"/>
+  <w:num w:numId="24">
+    <w:abstractNumId w:val="18"/>
   </w:num>
-  <w:num w:numId="3">
-    <w:abstractNumId w:val="10"/>
+  <w:num w:numId="25">
+    <w:abstractNumId w:val="6"/>
   </w:num>
-  <w:num w:numId="4">
-    <w:abstractNumId w:val="5"/>
-  </w:num>
-  <w:num w:numId="5">
+  <w:num w:numId="26">
     <w:abstractNumId w:val="17"/>
   </w:num>
-  <w:num w:numId="6">
+  <w:num w:numId="27">
     <w:abstractNumId w:val="0"/>
-  </w:num>
-  <w:num w:numId="7">
-    <w:abstractNumId w:val="12"/>
-  </w:num>
-  <w:num w:numId="8">
-    <w:abstractNumId w:val="16"/>
-  </w:num>
-  <w:num w:numId="9">
-    <w:abstractNumId w:val="6"/>
-  </w:num>
-  <w:num w:numId="10">
-    <w:abstractNumId w:val="9"/>
-  </w:num>
-  <w:num w:numId="11">
-    <w:abstractNumId w:val="15"/>
-  </w:num>
-  <w:num w:numId="12">
-    <w:abstractNumId w:val="7"/>
-  </w:num>
-  <w:num w:numId="13">
-    <w:abstractNumId w:val="1"/>
-  </w:num>
-  <w:num w:numId="14">
-    <w:abstractNumId w:val="11"/>
-  </w:num>
-  <w:num w:numId="15">
-    <w:abstractNumId w:val="8"/>
-  </w:num>
-  <w:num w:numId="16">
-    <w:abstractNumId w:val="2"/>
-  </w:num>
-  <w:num w:numId="17">
-    <w:abstractNumId w:val="13"/>
-  </w:num>
-  <w:num w:numId="18">
-    <w:abstractNumId w:val="14"/>
   </w:num>
 </w:numbering>
 </file>
@@ -7617,6 +9893,29 @@
       <w:lang w:bidi="ur-PK"/>
     </w:rPr>
   </w:style>
+  <w:style w:type="paragraph" w:styleId="Heading2">
+    <w:name w:val="heading 2"/>
+    <w:basedOn w:val="Normal"/>
+    <w:next w:val="Normal"/>
+    <w:link w:val="Heading2Char"/>
+    <w:uiPriority w:val="9"/>
+    <w:semiHidden/>
+    <w:unhideWhenUsed/>
+    <w:qFormat/>
+    <w:rsid w:val="002553C5"/>
+    <w:pPr>
+      <w:keepNext/>
+      <w:keepLines/>
+      <w:spacing w:before="40" w:after="0"/>
+      <w:outlineLvl w:val="1"/>
+    </w:pPr>
+    <w:rPr>
+      <w:rFonts w:asciiTheme="majorHAnsi" w:eastAsiaTheme="majorEastAsia" w:hAnsiTheme="majorHAnsi" w:cstheme="majorBidi"/>
+      <w:color w:val="2F5496" w:themeColor="accent1" w:themeShade="BF"/>
+      <w:sz w:val="26"/>
+      <w:szCs w:val="26"/>
+    </w:rPr>
+  </w:style>
   <w:style w:type="paragraph" w:styleId="Heading3">
     <w:name w:val="heading 3"/>
     <w:basedOn w:val="Normal"/>
@@ -7682,7 +9981,6 @@
     <w:name w:val="Normal (Web)"/>
     <w:basedOn w:val="Normal"/>
     <w:uiPriority w:val="99"/>
-    <w:semiHidden/>
     <w:unhideWhenUsed/>
     <w:rsid w:val="00053CAA"/>
     <w:pPr>
@@ -7831,6 +10129,31 @@
     <w:name w:val="label"/>
     <w:basedOn w:val="DefaultParagraphFont"/>
     <w:rsid w:val="00D3175E"/>
+  </w:style>
+  <w:style w:type="character" w:customStyle="1" w:styleId="citation-55">
+    <w:name w:val="citation-55"/>
+    <w:basedOn w:val="DefaultParagraphFont"/>
+    <w:rsid w:val="00092002"/>
+  </w:style>
+  <w:style w:type="character" w:customStyle="1" w:styleId="citation-44">
+    <w:name w:val="citation-44"/>
+    <w:basedOn w:val="DefaultParagraphFont"/>
+    <w:rsid w:val="0074252F"/>
+  </w:style>
+  <w:style w:type="character" w:customStyle="1" w:styleId="Heading2Char">
+    <w:name w:val="Heading 2 Char"/>
+    <w:basedOn w:val="DefaultParagraphFont"/>
+    <w:link w:val="Heading2"/>
+    <w:uiPriority w:val="9"/>
+    <w:semiHidden/>
+    <w:rsid w:val="002553C5"/>
+    <w:rPr>
+      <w:rFonts w:asciiTheme="majorHAnsi" w:eastAsiaTheme="majorEastAsia" w:hAnsiTheme="majorHAnsi" w:cstheme="majorBidi"/>
+      <w:color w:val="2F5496" w:themeColor="accent1" w:themeShade="BF"/>
+      <w:sz w:val="26"/>
+      <w:szCs w:val="26"/>
+      <w:lang w:bidi="ur-PK"/>
+    </w:rPr>
   </w:style>
 </w:styles>
 </file>

</xml_diff>